<commit_message>
Update HPC Showcase Draft document
Revised the HPC Showcase Draft.docx with new changes. See document for specific updates.
</commit_message>
<xml_diff>
--- a/showcase draft/HPC Showcase Draft.docx
+++ b/showcase draft/HPC Showcase Draft.docx
@@ -1205,6 +1205,1522 @@
       <w:pPr>
         <w:rPr>
           <w:rFonts w:ascii="Times New Roman" w:hAnsi="Times New Roman" w:cs="Times New Roman"/>
+        </w:rPr>
+      </w:pPr>
+    </w:p>
+    <w:p>
+      <w:pPr>
+        <w:rPr>
+          <w:rFonts w:ascii="Times New Roman" w:hAnsi="Times New Roman" w:cs="Times New Roman"/>
+        </w:rPr>
+      </w:pPr>
+    </w:p>
+    <w:p>
+      <w:pPr>
+        <w:rPr>
+          <w:rFonts w:ascii="Times New Roman" w:hAnsi="Times New Roman" w:cs="Times New Roman"/>
+        </w:rPr>
+      </w:pPr>
+    </w:p>
+    <w:p>
+      <w:pPr>
+        <w:rPr>
+          <w:rFonts w:ascii="Times New Roman" w:hAnsi="Times New Roman" w:cs="Times New Roman"/>
+        </w:rPr>
+      </w:pPr>
+    </w:p>
+    <w:p>
+      <w:pPr>
+        <w:rPr>
+          <w:rFonts w:ascii="Times New Roman" w:hAnsi="Times New Roman" w:cs="Times New Roman"/>
+        </w:rPr>
+      </w:pPr>
+    </w:p>
+    <w:p>
+      <w:pPr>
+        <w:rPr>
+          <w:rFonts w:ascii="Times New Roman" w:hAnsi="Times New Roman" w:cs="Times New Roman"/>
+        </w:rPr>
+      </w:pPr>
+    </w:p>
+    <w:p>
+      <w:pPr>
+        <w:rPr>
+          <w:rFonts w:ascii="Times New Roman" w:hAnsi="Times New Roman" w:cs="Times New Roman"/>
+        </w:rPr>
+      </w:pPr>
+    </w:p>
+    <w:p>
+      <w:pPr>
+        <w:rPr>
+          <w:rFonts w:ascii="Times New Roman" w:hAnsi="Times New Roman" w:cs="Times New Roman"/>
+        </w:rPr>
+      </w:pPr>
+    </w:p>
+    <w:p>
+      <w:pPr>
+        <w:rPr>
+          <w:rFonts w:ascii="Times New Roman" w:hAnsi="Times New Roman" w:cs="Times New Roman"/>
+        </w:rPr>
+      </w:pPr>
+    </w:p>
+    <w:p>
+      <w:pPr>
+        <w:rPr>
+          <w:rFonts w:ascii="Times New Roman" w:hAnsi="Times New Roman" w:cs="Times New Roman"/>
+        </w:rPr>
+      </w:pPr>
+    </w:p>
+    <w:p>
+      <w:pPr>
+        <w:rPr>
+          <w:rFonts w:ascii="Times New Roman" w:hAnsi="Times New Roman" w:cs="Times New Roman"/>
+        </w:rPr>
+      </w:pPr>
+    </w:p>
+    <w:p>
+      <w:pPr>
+        <w:rPr>
+          <w:rFonts w:ascii="Times New Roman" w:hAnsi="Times New Roman" w:cs="Times New Roman"/>
+        </w:rPr>
+      </w:pPr>
+    </w:p>
+    <w:p>
+      <w:pPr>
+        <w:rPr>
+          <w:rFonts w:ascii="Times New Roman" w:hAnsi="Times New Roman" w:cs="Times New Roman"/>
+        </w:rPr>
+      </w:pPr>
+    </w:p>
+    <w:p>
+      <w:pPr>
+        <w:rPr>
+          <w:rFonts w:ascii="Times New Roman" w:hAnsi="Times New Roman" w:cs="Times New Roman"/>
+        </w:rPr>
+      </w:pPr>
+    </w:p>
+    <w:p>
+      <w:pPr>
+        <w:rPr>
+          <w:rFonts w:ascii="Times New Roman" w:hAnsi="Times New Roman" w:cs="Times New Roman"/>
+        </w:rPr>
+      </w:pPr>
+    </w:p>
+    <w:p>
+      <w:pPr>
+        <w:rPr>
+          <w:rFonts w:ascii="Times New Roman" w:hAnsi="Times New Roman" w:cs="Times New Roman"/>
+        </w:rPr>
+      </w:pPr>
+    </w:p>
+    <w:p>
+      <w:pPr>
+        <w:rPr>
+          <w:rFonts w:ascii="Times New Roman" w:hAnsi="Times New Roman" w:cs="Times New Roman"/>
+        </w:rPr>
+      </w:pPr>
+    </w:p>
+    <w:p>
+      <w:pPr>
+        <w:rPr>
+          <w:rFonts w:ascii="Times New Roman" w:hAnsi="Times New Roman" w:cs="Times New Roman"/>
+        </w:rPr>
+      </w:pPr>
+    </w:p>
+    <w:p>
+      <w:pPr>
+        <w:rPr>
+          <w:rFonts w:ascii="Times New Roman" w:hAnsi="Times New Roman" w:cs="Times New Roman"/>
+        </w:rPr>
+      </w:pPr>
+    </w:p>
+    <w:p>
+      <w:pPr>
+        <w:rPr>
+          <w:rFonts w:ascii="Times New Roman" w:hAnsi="Times New Roman" w:cs="Times New Roman"/>
+        </w:rPr>
+      </w:pPr>
+    </w:p>
+    <w:p>
+      <w:pPr>
+        <w:rPr>
+          <w:rFonts w:ascii="Times New Roman" w:hAnsi="Times New Roman" w:cs="Times New Roman"/>
+        </w:rPr>
+      </w:pPr>
+    </w:p>
+    <w:p>
+      <w:pPr>
+        <w:rPr>
+          <w:rFonts w:ascii="Times New Roman" w:hAnsi="Times New Roman" w:cs="Times New Roman"/>
+        </w:rPr>
+      </w:pPr>
+    </w:p>
+    <w:p>
+      <w:pPr>
+        <w:rPr>
+          <w:rFonts w:ascii="Times New Roman" w:hAnsi="Times New Roman" w:cs="Times New Roman"/>
+        </w:rPr>
+      </w:pPr>
+    </w:p>
+    <w:p>
+      <w:pPr>
+        <w:rPr>
+          <w:rFonts w:ascii="Times New Roman" w:hAnsi="Times New Roman" w:cs="Times New Roman"/>
+          <w:b/>
+          <w:bCs/>
+        </w:rPr>
+      </w:pPr>
+      <w:r>
+        <w:rPr>
+          <w:rFonts w:ascii="Times New Roman" w:hAnsi="Times New Roman" w:cs="Times New Roman"/>
+          <w:b/>
+          <w:bCs/>
+        </w:rPr>
+        <w:t>PROJECT PURPOSE &amp; PROBLEM</w:t>
+      </w:r>
+    </w:p>
+    <w:p>
+      <w:pPr>
+        <w:numPr>
+          <w:ilvl w:val="0"/>
+          <w:numId w:val="6"/>
+        </w:numPr>
+        <w:rPr>
+          <w:rFonts w:ascii="Times New Roman" w:hAnsi="Times New Roman" w:cs="Times New Roman"/>
+          <w:b/>
+          <w:bCs/>
+        </w:rPr>
+      </w:pPr>
+      <w:r>
+        <w:rPr>
+          <w:rFonts w:ascii="Times New Roman" w:hAnsi="Times New Roman" w:cs="Times New Roman"/>
+          <w:b/>
+          <w:bCs/>
+        </w:rPr>
+        <w:t xml:space="preserve">Most new HPC users don’t know how to use </w:t>
+      </w:r>
+      <w:proofErr w:type="spellStart"/>
+      <w:r>
+        <w:rPr>
+          <w:rFonts w:ascii="Times New Roman" w:hAnsi="Times New Roman" w:cs="Times New Roman"/>
+          <w:b/>
+          <w:bCs/>
+        </w:rPr>
+        <w:t>Slurm</w:t>
+      </w:r>
+      <w:proofErr w:type="spellEnd"/>
+      <w:r>
+        <w:rPr>
+          <w:rFonts w:ascii="Times New Roman" w:hAnsi="Times New Roman" w:cs="Times New Roman"/>
+          <w:b/>
+          <w:bCs/>
+        </w:rPr>
+        <w:t xml:space="preserve">, request resources, or navigate cluster environments. </w:t>
+      </w:r>
+      <w:proofErr w:type="spellStart"/>
+      <w:r>
+        <w:rPr>
+          <w:rFonts w:ascii="Times New Roman" w:hAnsi="Times New Roman" w:cs="Times New Roman"/>
+          <w:b/>
+          <w:bCs/>
+        </w:rPr>
+        <w:t>Inkly</w:t>
+      </w:r>
+      <w:proofErr w:type="spellEnd"/>
+      <w:r>
+        <w:rPr>
+          <w:rFonts w:ascii="Times New Roman" w:hAnsi="Times New Roman" w:cs="Times New Roman"/>
+          <w:b/>
+          <w:bCs/>
+        </w:rPr>
+        <w:t xml:space="preserve"> removes that barrier by providing an AI-assisted layer over the HPC cluster.</w:t>
+      </w:r>
+    </w:p>
+    <w:p>
+      <w:pPr>
+        <w:numPr>
+          <w:ilvl w:val="0"/>
+          <w:numId w:val="6"/>
+        </w:numPr>
+        <w:rPr>
+          <w:rFonts w:ascii="Times New Roman" w:hAnsi="Times New Roman" w:cs="Times New Roman"/>
+          <w:b/>
+          <w:bCs/>
+        </w:rPr>
+      </w:pPr>
+      <w:r>
+        <w:rPr>
+          <w:rFonts w:ascii="Times New Roman" w:hAnsi="Times New Roman" w:cs="Times New Roman"/>
+          <w:b/>
+          <w:bCs/>
+        </w:rPr>
+        <w:t xml:space="preserve">We built </w:t>
+      </w:r>
+      <w:proofErr w:type="spellStart"/>
+      <w:r>
+        <w:rPr>
+          <w:rFonts w:ascii="Times New Roman" w:hAnsi="Times New Roman" w:cs="Times New Roman"/>
+          <w:b/>
+          <w:bCs/>
+        </w:rPr>
+        <w:t>Inkly</w:t>
+      </w:r>
+      <w:proofErr w:type="spellEnd"/>
+      <w:r>
+        <w:rPr>
+          <w:rFonts w:ascii="Times New Roman" w:hAnsi="Times New Roman" w:cs="Times New Roman"/>
+          <w:b/>
+          <w:bCs/>
+        </w:rPr>
+        <w:t xml:space="preserve"> to make HPC accessible to beginners without compromising safety, performance, or cluster integrity.</w:t>
+      </w:r>
+    </w:p>
+    <w:p>
+      <w:pPr>
+        <w:numPr>
+          <w:ilvl w:val="0"/>
+          <w:numId w:val="6"/>
+        </w:numPr>
+        <w:rPr>
+          <w:rFonts w:ascii="Times New Roman" w:hAnsi="Times New Roman" w:cs="Times New Roman"/>
+          <w:b/>
+          <w:bCs/>
+        </w:rPr>
+      </w:pPr>
+      <w:r>
+        <w:rPr>
+          <w:rFonts w:ascii="Times New Roman" w:hAnsi="Times New Roman" w:cs="Times New Roman"/>
+          <w:b/>
+          <w:bCs/>
+        </w:rPr>
+        <w:t xml:space="preserve">It’s for students, researchers, and new HPC users who need to run jobs but don’t have deep experience with </w:t>
+      </w:r>
+      <w:proofErr w:type="spellStart"/>
+      <w:r>
+        <w:rPr>
+          <w:rFonts w:ascii="Times New Roman" w:hAnsi="Times New Roman" w:cs="Times New Roman"/>
+          <w:b/>
+          <w:bCs/>
+        </w:rPr>
+        <w:t>Slurm</w:t>
+      </w:r>
+      <w:proofErr w:type="spellEnd"/>
+      <w:r>
+        <w:rPr>
+          <w:rFonts w:ascii="Times New Roman" w:hAnsi="Times New Roman" w:cs="Times New Roman"/>
+          <w:b/>
+          <w:bCs/>
+        </w:rPr>
+        <w:t xml:space="preserve"> or Linux tools.</w:t>
+      </w:r>
+    </w:p>
+    <w:p>
+      <w:pPr>
+        <w:rPr>
+          <w:rFonts w:ascii="Times New Roman" w:hAnsi="Times New Roman" w:cs="Times New Roman"/>
+          <w:b/>
+          <w:bCs/>
+        </w:rPr>
+      </w:pPr>
+      <w:r>
+        <w:rPr>
+          <w:rFonts w:ascii="Times New Roman" w:hAnsi="Times New Roman" w:cs="Times New Roman"/>
+          <w:b/>
+          <w:bCs/>
+        </w:rPr>
+        <w:pict w14:anchorId="14CF2B96">
+          <v:rect id="_x0000_i1073" style="width:0;height:1.5pt" o:hralign="center" o:hrstd="t" o:hr="t" fillcolor="#a0a0a0" stroked="f"/>
+        </w:pict>
+      </w:r>
+    </w:p>
+    <w:p>
+      <w:pPr>
+        <w:rPr>
+          <w:rFonts w:ascii="Times New Roman" w:hAnsi="Times New Roman" w:cs="Times New Roman"/>
+          <w:b/>
+          <w:bCs/>
+        </w:rPr>
+      </w:pPr>
+      <w:r>
+        <w:rPr>
+          <w:rFonts w:ascii="Times New Roman" w:hAnsi="Times New Roman" w:cs="Times New Roman"/>
+          <w:b/>
+          <w:bCs/>
+        </w:rPr>
+        <w:t>TECHNICAL SKILLS &amp; TOOLS</w:t>
+      </w:r>
+    </w:p>
+    <w:p>
+      <w:pPr>
+        <w:numPr>
+          <w:ilvl w:val="0"/>
+          <w:numId w:val="7"/>
+        </w:numPr>
+        <w:rPr>
+          <w:rFonts w:ascii="Times New Roman" w:hAnsi="Times New Roman" w:cs="Times New Roman"/>
+          <w:b/>
+          <w:bCs/>
+        </w:rPr>
+      </w:pPr>
+      <w:r>
+        <w:rPr>
+          <w:rFonts w:ascii="Times New Roman" w:hAnsi="Times New Roman" w:cs="Times New Roman"/>
+          <w:b/>
+          <w:bCs/>
+        </w:rPr>
+        <w:t xml:space="preserve">Shell scripting with Bash, Python automation tools, and </w:t>
+      </w:r>
+      <w:proofErr w:type="spellStart"/>
+      <w:r>
+        <w:rPr>
+          <w:rFonts w:ascii="Times New Roman" w:hAnsi="Times New Roman" w:cs="Times New Roman"/>
+          <w:b/>
+          <w:bCs/>
+        </w:rPr>
+        <w:t>Slurm</w:t>
+      </w:r>
+      <w:proofErr w:type="spellEnd"/>
+      <w:r>
+        <w:rPr>
+          <w:rFonts w:ascii="Times New Roman" w:hAnsi="Times New Roman" w:cs="Times New Roman"/>
+          <w:b/>
+          <w:bCs/>
+        </w:rPr>
+        <w:t xml:space="preserve"> job scheduling concepts (</w:t>
+      </w:r>
+      <w:proofErr w:type="spellStart"/>
+      <w:r>
+        <w:rPr>
+          <w:rFonts w:ascii="Times New Roman" w:hAnsi="Times New Roman" w:cs="Times New Roman"/>
+          <w:b/>
+          <w:bCs/>
+        </w:rPr>
+        <w:t>squeue</w:t>
+      </w:r>
+      <w:proofErr w:type="spellEnd"/>
+      <w:r>
+        <w:rPr>
+          <w:rFonts w:ascii="Times New Roman" w:hAnsi="Times New Roman" w:cs="Times New Roman"/>
+          <w:b/>
+          <w:bCs/>
+        </w:rPr>
+        <w:t xml:space="preserve">, </w:t>
+      </w:r>
+      <w:proofErr w:type="spellStart"/>
+      <w:r>
+        <w:rPr>
+          <w:rFonts w:ascii="Times New Roman" w:hAnsi="Times New Roman" w:cs="Times New Roman"/>
+          <w:b/>
+          <w:bCs/>
+        </w:rPr>
+        <w:t>sinfo</w:t>
+      </w:r>
+      <w:proofErr w:type="spellEnd"/>
+      <w:r>
+        <w:rPr>
+          <w:rFonts w:ascii="Times New Roman" w:hAnsi="Times New Roman" w:cs="Times New Roman"/>
+          <w:b/>
+          <w:bCs/>
+        </w:rPr>
+        <w:t xml:space="preserve">, </w:t>
+      </w:r>
+      <w:proofErr w:type="spellStart"/>
+      <w:r>
+        <w:rPr>
+          <w:rFonts w:ascii="Times New Roman" w:hAnsi="Times New Roman" w:cs="Times New Roman"/>
+          <w:b/>
+          <w:bCs/>
+        </w:rPr>
+        <w:t>sbatch</w:t>
+      </w:r>
+      <w:proofErr w:type="spellEnd"/>
+      <w:r>
+        <w:rPr>
+          <w:rFonts w:ascii="Times New Roman" w:hAnsi="Times New Roman" w:cs="Times New Roman"/>
+          <w:b/>
+          <w:bCs/>
+        </w:rPr>
+        <w:t>).</w:t>
+      </w:r>
+    </w:p>
+    <w:p>
+      <w:pPr>
+        <w:numPr>
+          <w:ilvl w:val="0"/>
+          <w:numId w:val="7"/>
+        </w:numPr>
+        <w:rPr>
+          <w:rFonts w:ascii="Times New Roman" w:hAnsi="Times New Roman" w:cs="Times New Roman"/>
+          <w:b/>
+          <w:bCs/>
+        </w:rPr>
+      </w:pPr>
+      <w:r>
+        <w:rPr>
+          <w:rFonts w:ascii="Times New Roman" w:hAnsi="Times New Roman" w:cs="Times New Roman"/>
+          <w:b/>
+          <w:bCs/>
+        </w:rPr>
+        <w:t>GitHub Copilot CLI and MCP tooling, including secure wrappers around AI-generated commands.</w:t>
+      </w:r>
+    </w:p>
+    <w:p>
+      <w:pPr>
+        <w:numPr>
+          <w:ilvl w:val="0"/>
+          <w:numId w:val="7"/>
+        </w:numPr>
+        <w:rPr>
+          <w:rFonts w:ascii="Times New Roman" w:hAnsi="Times New Roman" w:cs="Times New Roman"/>
+          <w:b/>
+          <w:bCs/>
+        </w:rPr>
+      </w:pPr>
+      <w:r>
+        <w:rPr>
+          <w:rFonts w:ascii="Times New Roman" w:hAnsi="Times New Roman" w:cs="Times New Roman"/>
+          <w:b/>
+          <w:bCs/>
+        </w:rPr>
+        <w:t xml:space="preserve">NVM/Node setup, </w:t>
+      </w:r>
+      <w:proofErr w:type="spellStart"/>
+      <w:r>
+        <w:rPr>
+          <w:rFonts w:ascii="Times New Roman" w:hAnsi="Times New Roman" w:cs="Times New Roman"/>
+          <w:b/>
+          <w:bCs/>
+        </w:rPr>
+        <w:t>Apptainer</w:t>
+      </w:r>
+      <w:proofErr w:type="spellEnd"/>
+      <w:r>
+        <w:rPr>
+          <w:rFonts w:ascii="Times New Roman" w:hAnsi="Times New Roman" w:cs="Times New Roman"/>
+          <w:b/>
+          <w:bCs/>
+        </w:rPr>
+        <w:t xml:space="preserve"> containerization, environment modules, HPC cluster configuration, logging infrastructure, and system-safe execution patterns.</w:t>
+      </w:r>
+    </w:p>
+    <w:p>
+      <w:pPr>
+        <w:rPr>
+          <w:rFonts w:ascii="Times New Roman" w:hAnsi="Times New Roman" w:cs="Times New Roman"/>
+          <w:b/>
+          <w:bCs/>
+        </w:rPr>
+      </w:pPr>
+      <w:r>
+        <w:rPr>
+          <w:rFonts w:ascii="Times New Roman" w:hAnsi="Times New Roman" w:cs="Times New Roman"/>
+          <w:b/>
+          <w:bCs/>
+        </w:rPr>
+        <w:pict w14:anchorId="6AC7D834">
+          <v:rect id="_x0000_i1074" style="width:0;height:1.5pt" o:hralign="center" o:hrstd="t" o:hr="t" fillcolor="#a0a0a0" stroked="f"/>
+        </w:pict>
+      </w:r>
+    </w:p>
+    <w:p>
+      <w:pPr>
+        <w:rPr>
+          <w:rFonts w:ascii="Times New Roman" w:hAnsi="Times New Roman" w:cs="Times New Roman"/>
+          <w:b/>
+          <w:bCs/>
+        </w:rPr>
+      </w:pPr>
+      <w:r>
+        <w:rPr>
+          <w:rFonts w:ascii="Times New Roman" w:hAnsi="Times New Roman" w:cs="Times New Roman"/>
+          <w:b/>
+          <w:bCs/>
+        </w:rPr>
+        <w:t>YOUR ROLE &amp; CONTRIBUTIONS</w:t>
+      </w:r>
+    </w:p>
+    <w:p>
+      <w:pPr>
+        <w:numPr>
+          <w:ilvl w:val="0"/>
+          <w:numId w:val="8"/>
+        </w:numPr>
+        <w:rPr>
+          <w:rFonts w:ascii="Times New Roman" w:hAnsi="Times New Roman" w:cs="Times New Roman"/>
+          <w:b/>
+          <w:bCs/>
+        </w:rPr>
+      </w:pPr>
+      <w:r>
+        <w:rPr>
+          <w:rFonts w:ascii="Times New Roman" w:hAnsi="Times New Roman" w:cs="Times New Roman"/>
+          <w:b/>
+          <w:bCs/>
+        </w:rPr>
+        <w:t xml:space="preserve">Designed the wrapper architecture (ink.sh + Python helpers) that sits on top of Copilot and </w:t>
+      </w:r>
+      <w:proofErr w:type="spellStart"/>
+      <w:r>
+        <w:rPr>
+          <w:rFonts w:ascii="Times New Roman" w:hAnsi="Times New Roman" w:cs="Times New Roman"/>
+          <w:b/>
+          <w:bCs/>
+        </w:rPr>
+        <w:t>Slurm</w:t>
+      </w:r>
+      <w:proofErr w:type="spellEnd"/>
+      <w:r>
+        <w:rPr>
+          <w:rFonts w:ascii="Times New Roman" w:hAnsi="Times New Roman" w:cs="Times New Roman"/>
+          <w:b/>
+          <w:bCs/>
+        </w:rPr>
+        <w:t>.</w:t>
+      </w:r>
+    </w:p>
+    <w:p>
+      <w:pPr>
+        <w:numPr>
+          <w:ilvl w:val="0"/>
+          <w:numId w:val="8"/>
+        </w:numPr>
+        <w:rPr>
+          <w:rFonts w:ascii="Times New Roman" w:hAnsi="Times New Roman" w:cs="Times New Roman"/>
+          <w:b/>
+          <w:bCs/>
+        </w:rPr>
+      </w:pPr>
+      <w:r>
+        <w:rPr>
+          <w:rFonts w:ascii="Times New Roman" w:hAnsi="Times New Roman" w:cs="Times New Roman"/>
+          <w:b/>
+          <w:bCs/>
+        </w:rPr>
+        <w:t>Built the global/per-user logging system and structured the plan for controlled research-grade log collection.</w:t>
+      </w:r>
+    </w:p>
+    <w:p>
+      <w:pPr>
+        <w:numPr>
+          <w:ilvl w:val="0"/>
+          <w:numId w:val="8"/>
+        </w:numPr>
+        <w:rPr>
+          <w:rFonts w:ascii="Times New Roman" w:hAnsi="Times New Roman" w:cs="Times New Roman"/>
+          <w:b/>
+          <w:bCs/>
+        </w:rPr>
+      </w:pPr>
+      <w:r>
+        <w:rPr>
+          <w:rFonts w:ascii="Times New Roman" w:hAnsi="Times New Roman" w:cs="Times New Roman"/>
+          <w:b/>
+          <w:bCs/>
+        </w:rPr>
+        <w:t>Implemented safety guardrails to prevent destructive commands and designed the containerized execution approach.</w:t>
+      </w:r>
+    </w:p>
+    <w:p>
+      <w:pPr>
+        <w:numPr>
+          <w:ilvl w:val="0"/>
+          <w:numId w:val="8"/>
+        </w:numPr>
+        <w:rPr>
+          <w:rFonts w:ascii="Times New Roman" w:hAnsi="Times New Roman" w:cs="Times New Roman"/>
+          <w:b/>
+          <w:bCs/>
+        </w:rPr>
+      </w:pPr>
+      <w:r>
+        <w:rPr>
+          <w:rFonts w:ascii="Times New Roman" w:hAnsi="Times New Roman" w:cs="Times New Roman"/>
+          <w:b/>
+          <w:bCs/>
+        </w:rPr>
+        <w:t xml:space="preserve">Led development of the GitHub repo, installer, uninstaller, and documentation to make </w:t>
+      </w:r>
+      <w:proofErr w:type="spellStart"/>
+      <w:r>
+        <w:rPr>
+          <w:rFonts w:ascii="Times New Roman" w:hAnsi="Times New Roman" w:cs="Times New Roman"/>
+          <w:b/>
+          <w:bCs/>
+        </w:rPr>
+        <w:t>Inkly</w:t>
+      </w:r>
+      <w:proofErr w:type="spellEnd"/>
+      <w:r>
+        <w:rPr>
+          <w:rFonts w:ascii="Times New Roman" w:hAnsi="Times New Roman" w:cs="Times New Roman"/>
+          <w:b/>
+          <w:bCs/>
+        </w:rPr>
+        <w:t xml:space="preserve"> portable and </w:t>
+      </w:r>
+      <w:proofErr w:type="gramStart"/>
+      <w:r>
+        <w:rPr>
+          <w:rFonts w:ascii="Times New Roman" w:hAnsi="Times New Roman" w:cs="Times New Roman"/>
+          <w:b/>
+          <w:bCs/>
+        </w:rPr>
+        <w:t>cluster-aware</w:t>
+      </w:r>
+      <w:proofErr w:type="gramEnd"/>
+      <w:r>
+        <w:rPr>
+          <w:rFonts w:ascii="Times New Roman" w:hAnsi="Times New Roman" w:cs="Times New Roman"/>
+          <w:b/>
+          <w:bCs/>
+        </w:rPr>
+        <w:t>.</w:t>
+      </w:r>
+    </w:p>
+    <w:p>
+      <w:pPr>
+        <w:rPr>
+          <w:rFonts w:ascii="Times New Roman" w:hAnsi="Times New Roman" w:cs="Times New Roman"/>
+          <w:b/>
+          <w:bCs/>
+        </w:rPr>
+      </w:pPr>
+      <w:r>
+        <w:rPr>
+          <w:rFonts w:ascii="Times New Roman" w:hAnsi="Times New Roman" w:cs="Times New Roman"/>
+          <w:b/>
+          <w:bCs/>
+        </w:rPr>
+        <w:pict w14:anchorId="0FBE445F">
+          <v:rect id="_x0000_i1075" style="width:0;height:1.5pt" o:hralign="center" o:hrstd="t" o:hr="t" fillcolor="#a0a0a0" stroked="f"/>
+        </w:pict>
+      </w:r>
+    </w:p>
+    <w:p>
+      <w:pPr>
+        <w:rPr>
+          <w:rFonts w:ascii="Times New Roman" w:hAnsi="Times New Roman" w:cs="Times New Roman"/>
+          <w:b/>
+          <w:bCs/>
+        </w:rPr>
+      </w:pPr>
+      <w:r>
+        <w:rPr>
+          <w:rFonts w:ascii="Times New Roman" w:hAnsi="Times New Roman" w:cs="Times New Roman"/>
+          <w:b/>
+          <w:bCs/>
+        </w:rPr>
+        <w:t>CHALLENGES &amp; SOLUTIONS</w:t>
+      </w:r>
+    </w:p>
+    <w:p>
+      <w:pPr>
+        <w:numPr>
+          <w:ilvl w:val="0"/>
+          <w:numId w:val="9"/>
+        </w:numPr>
+        <w:rPr>
+          <w:rFonts w:ascii="Times New Roman" w:hAnsi="Times New Roman" w:cs="Times New Roman"/>
+          <w:b/>
+          <w:bCs/>
+        </w:rPr>
+      </w:pPr>
+      <w:r>
+        <w:rPr>
+          <w:rFonts w:ascii="Times New Roman" w:hAnsi="Times New Roman" w:cs="Times New Roman"/>
+          <w:b/>
+          <w:bCs/>
+        </w:rPr>
+        <w:t>Copilot CLI kept changing formats (</w:t>
+      </w:r>
+      <w:proofErr w:type="spellStart"/>
+      <w:r>
+        <w:rPr>
+          <w:rFonts w:ascii="Times New Roman" w:hAnsi="Times New Roman" w:cs="Times New Roman"/>
+          <w:b/>
+          <w:bCs/>
+        </w:rPr>
+        <w:t>gh</w:t>
+      </w:r>
+      <w:proofErr w:type="spellEnd"/>
+      <w:r>
+        <w:rPr>
+          <w:rFonts w:ascii="Times New Roman" w:hAnsi="Times New Roman" w:cs="Times New Roman"/>
+          <w:b/>
+          <w:bCs/>
+        </w:rPr>
+        <w:t xml:space="preserve"> extension deprecated, new CLI behavior). I redesigned wrapper functions multiple times to keep them working.</w:t>
+      </w:r>
+    </w:p>
+    <w:p>
+      <w:pPr>
+        <w:numPr>
+          <w:ilvl w:val="0"/>
+          <w:numId w:val="9"/>
+        </w:numPr>
+        <w:rPr>
+          <w:rFonts w:ascii="Times New Roman" w:hAnsi="Times New Roman" w:cs="Times New Roman"/>
+          <w:b/>
+          <w:bCs/>
+        </w:rPr>
+      </w:pPr>
+      <w:r>
+        <w:rPr>
+          <w:rFonts w:ascii="Times New Roman" w:hAnsi="Times New Roman" w:cs="Times New Roman"/>
+          <w:b/>
+          <w:bCs/>
+        </w:rPr>
+        <w:lastRenderedPageBreak/>
+        <w:t xml:space="preserve">Permission-restricted HPC environment made automation tricky. Solved this by offloading operations into controlled </w:t>
+      </w:r>
+      <w:proofErr w:type="spellStart"/>
+      <w:r>
+        <w:rPr>
+          <w:rFonts w:ascii="Times New Roman" w:hAnsi="Times New Roman" w:cs="Times New Roman"/>
+          <w:b/>
+          <w:bCs/>
+        </w:rPr>
+        <w:t>Apptainer</w:t>
+      </w:r>
+      <w:proofErr w:type="spellEnd"/>
+      <w:r>
+        <w:rPr>
+          <w:rFonts w:ascii="Times New Roman" w:hAnsi="Times New Roman" w:cs="Times New Roman"/>
+          <w:b/>
+          <w:bCs/>
+        </w:rPr>
+        <w:t xml:space="preserve"> containers and restricting file access.</w:t>
+      </w:r>
+    </w:p>
+    <w:p>
+      <w:pPr>
+        <w:numPr>
+          <w:ilvl w:val="0"/>
+          <w:numId w:val="9"/>
+        </w:numPr>
+        <w:rPr>
+          <w:rFonts w:ascii="Times New Roman" w:hAnsi="Times New Roman" w:cs="Times New Roman"/>
+          <w:b/>
+          <w:bCs/>
+        </w:rPr>
+      </w:pPr>
+      <w:proofErr w:type="spellStart"/>
+      <w:r>
+        <w:rPr>
+          <w:rFonts w:ascii="Times New Roman" w:hAnsi="Times New Roman" w:cs="Times New Roman"/>
+          <w:b/>
+          <w:bCs/>
+        </w:rPr>
+        <w:t>Slurm</w:t>
+      </w:r>
+      <w:proofErr w:type="spellEnd"/>
+      <w:r>
+        <w:rPr>
+          <w:rFonts w:ascii="Times New Roman" w:hAnsi="Times New Roman" w:cs="Times New Roman"/>
+          <w:b/>
+          <w:bCs/>
+        </w:rPr>
+        <w:t xml:space="preserve"> context is cluster-specific, so I built a configuration-driven approach instead of hardcoding partitions or paths.</w:t>
+      </w:r>
+    </w:p>
+    <w:p>
+      <w:pPr>
+        <w:rPr>
+          <w:rFonts w:ascii="Times New Roman" w:hAnsi="Times New Roman" w:cs="Times New Roman"/>
+          <w:b/>
+          <w:bCs/>
+        </w:rPr>
+      </w:pPr>
+      <w:r>
+        <w:rPr>
+          <w:rFonts w:ascii="Times New Roman" w:hAnsi="Times New Roman" w:cs="Times New Roman"/>
+          <w:b/>
+          <w:bCs/>
+        </w:rPr>
+        <w:pict w14:anchorId="11519F32">
+          <v:rect id="_x0000_i1076" style="width:0;height:1.5pt" o:hralign="center" o:hrstd="t" o:hr="t" fillcolor="#a0a0a0" stroked="f"/>
+        </w:pict>
+      </w:r>
+    </w:p>
+    <w:p>
+      <w:pPr>
+        <w:rPr>
+          <w:rFonts w:ascii="Times New Roman" w:hAnsi="Times New Roman" w:cs="Times New Roman"/>
+          <w:b/>
+          <w:bCs/>
+        </w:rPr>
+      </w:pPr>
+      <w:r>
+        <w:rPr>
+          <w:rFonts w:ascii="Times New Roman" w:hAnsi="Times New Roman" w:cs="Times New Roman"/>
+          <w:b/>
+          <w:bCs/>
+        </w:rPr>
+        <w:t>PROJECT FEATURES &amp; RESULTS</w:t>
+      </w:r>
+    </w:p>
+    <w:p>
+      <w:pPr>
+        <w:numPr>
+          <w:ilvl w:val="0"/>
+          <w:numId w:val="10"/>
+        </w:numPr>
+        <w:rPr>
+          <w:rFonts w:ascii="Times New Roman" w:hAnsi="Times New Roman" w:cs="Times New Roman"/>
+          <w:b/>
+          <w:bCs/>
+        </w:rPr>
+      </w:pPr>
+      <w:proofErr w:type="gramStart"/>
+      <w:r>
+        <w:rPr>
+          <w:rFonts w:ascii="Times New Roman" w:hAnsi="Times New Roman" w:cs="Times New Roman"/>
+          <w:b/>
+          <w:bCs/>
+        </w:rPr>
+        <w:t>Natural-language</w:t>
+      </w:r>
+      <w:proofErr w:type="gramEnd"/>
+      <w:r>
+        <w:rPr>
+          <w:rFonts w:ascii="Times New Roman" w:hAnsi="Times New Roman" w:cs="Times New Roman"/>
+          <w:b/>
+          <w:bCs/>
+        </w:rPr>
+        <w:t xml:space="preserve"> </w:t>
+      </w:r>
+      <w:proofErr w:type="spellStart"/>
+      <w:r>
+        <w:rPr>
+          <w:rFonts w:ascii="Times New Roman" w:hAnsi="Times New Roman" w:cs="Times New Roman"/>
+          <w:b/>
+          <w:bCs/>
+        </w:rPr>
+        <w:t>sbatch</w:t>
+      </w:r>
+      <w:proofErr w:type="spellEnd"/>
+      <w:r>
+        <w:rPr>
+          <w:rFonts w:ascii="Times New Roman" w:hAnsi="Times New Roman" w:cs="Times New Roman"/>
+          <w:b/>
+          <w:bCs/>
+        </w:rPr>
+        <w:t xml:space="preserve"> generation that </w:t>
+      </w:r>
+      <w:proofErr w:type="gramStart"/>
+      <w:r>
+        <w:rPr>
+          <w:rFonts w:ascii="Times New Roman" w:hAnsi="Times New Roman" w:cs="Times New Roman"/>
+          <w:b/>
+          <w:bCs/>
+        </w:rPr>
+        <w:t>uses</w:t>
+      </w:r>
+      <w:proofErr w:type="gramEnd"/>
+      <w:r>
+        <w:rPr>
+          <w:rFonts w:ascii="Times New Roman" w:hAnsi="Times New Roman" w:cs="Times New Roman"/>
+          <w:b/>
+          <w:bCs/>
+        </w:rPr>
+        <w:t xml:space="preserve"> real cluster data (partitions, GPUs, limits).</w:t>
+      </w:r>
+    </w:p>
+    <w:p>
+      <w:pPr>
+        <w:numPr>
+          <w:ilvl w:val="0"/>
+          <w:numId w:val="10"/>
+        </w:numPr>
+        <w:rPr>
+          <w:rFonts w:ascii="Times New Roman" w:hAnsi="Times New Roman" w:cs="Times New Roman"/>
+          <w:b/>
+          <w:bCs/>
+        </w:rPr>
+      </w:pPr>
+      <w:r>
+        <w:rPr>
+          <w:rFonts w:ascii="Times New Roman" w:hAnsi="Times New Roman" w:cs="Times New Roman"/>
+          <w:b/>
+          <w:bCs/>
+        </w:rPr>
+        <w:t xml:space="preserve">Automated queue/status tools that wrap </w:t>
+      </w:r>
+      <w:proofErr w:type="spellStart"/>
+      <w:r>
+        <w:rPr>
+          <w:rFonts w:ascii="Times New Roman" w:hAnsi="Times New Roman" w:cs="Times New Roman"/>
+          <w:b/>
+          <w:bCs/>
+        </w:rPr>
+        <w:t>squeue</w:t>
+      </w:r>
+      <w:proofErr w:type="spellEnd"/>
+      <w:r>
+        <w:rPr>
+          <w:rFonts w:ascii="Times New Roman" w:hAnsi="Times New Roman" w:cs="Times New Roman"/>
+          <w:b/>
+          <w:bCs/>
+        </w:rPr>
+        <w:t xml:space="preserve">, </w:t>
+      </w:r>
+      <w:proofErr w:type="spellStart"/>
+      <w:r>
+        <w:rPr>
+          <w:rFonts w:ascii="Times New Roman" w:hAnsi="Times New Roman" w:cs="Times New Roman"/>
+          <w:b/>
+          <w:bCs/>
+        </w:rPr>
+        <w:t>sinfo</w:t>
+      </w:r>
+      <w:proofErr w:type="spellEnd"/>
+      <w:r>
+        <w:rPr>
+          <w:rFonts w:ascii="Times New Roman" w:hAnsi="Times New Roman" w:cs="Times New Roman"/>
+          <w:b/>
+          <w:bCs/>
+        </w:rPr>
+        <w:t>, etc., into readable explanations.</w:t>
+      </w:r>
+    </w:p>
+    <w:p>
+      <w:pPr>
+        <w:numPr>
+          <w:ilvl w:val="0"/>
+          <w:numId w:val="10"/>
+        </w:numPr>
+        <w:rPr>
+          <w:rFonts w:ascii="Times New Roman" w:hAnsi="Times New Roman" w:cs="Times New Roman"/>
+          <w:b/>
+          <w:bCs/>
+        </w:rPr>
+      </w:pPr>
+      <w:r>
+        <w:rPr>
+          <w:rFonts w:ascii="Times New Roman" w:hAnsi="Times New Roman" w:cs="Times New Roman"/>
+          <w:b/>
+          <w:bCs/>
+        </w:rPr>
+        <w:t>Logging system that tracks user questions, AI responses, job outcomes, and patterns for future research.</w:t>
+      </w:r>
+    </w:p>
+    <w:p>
+      <w:pPr>
+        <w:numPr>
+          <w:ilvl w:val="0"/>
+          <w:numId w:val="10"/>
+        </w:numPr>
+        <w:rPr>
+          <w:rFonts w:ascii="Times New Roman" w:hAnsi="Times New Roman" w:cs="Times New Roman"/>
+          <w:b/>
+          <w:bCs/>
+        </w:rPr>
+      </w:pPr>
+      <w:r>
+        <w:rPr>
+          <w:rFonts w:ascii="Times New Roman" w:hAnsi="Times New Roman" w:cs="Times New Roman"/>
+          <w:b/>
+          <w:bCs/>
+        </w:rPr>
+        <w:t xml:space="preserve">Portable installer, safer execution, and an </w:t>
+      </w:r>
+      <w:proofErr w:type="spellStart"/>
+      <w:r>
+        <w:rPr>
+          <w:rFonts w:ascii="Times New Roman" w:hAnsi="Times New Roman" w:cs="Times New Roman"/>
+          <w:b/>
+          <w:bCs/>
+        </w:rPr>
+        <w:t>Apptainer</w:t>
+      </w:r>
+      <w:proofErr w:type="spellEnd"/>
+      <w:r>
+        <w:rPr>
+          <w:rFonts w:ascii="Times New Roman" w:hAnsi="Times New Roman" w:cs="Times New Roman"/>
+          <w:b/>
+          <w:bCs/>
+        </w:rPr>
+        <w:t>-based environment that cannot damage the host filesystem.</w:t>
+      </w:r>
+    </w:p>
+    <w:p>
+      <w:pPr>
+        <w:rPr>
+          <w:rFonts w:ascii="Times New Roman" w:hAnsi="Times New Roman" w:cs="Times New Roman"/>
+          <w:b/>
+          <w:bCs/>
+        </w:rPr>
+      </w:pPr>
+      <w:r>
+        <w:rPr>
+          <w:rFonts w:ascii="Times New Roman" w:hAnsi="Times New Roman" w:cs="Times New Roman"/>
+          <w:b/>
+          <w:bCs/>
+        </w:rPr>
+        <w:pict w14:anchorId="0354FADD">
+          <v:rect id="_x0000_i1077" style="width:0;height:1.5pt" o:hralign="center" o:hrstd="t" o:hr="t" fillcolor="#a0a0a0" stroked="f"/>
+        </w:pict>
+      </w:r>
+    </w:p>
+    <w:p>
+      <w:pPr>
+        <w:rPr>
+          <w:rFonts w:ascii="Times New Roman" w:hAnsi="Times New Roman" w:cs="Times New Roman"/>
+          <w:b/>
+          <w:bCs/>
+        </w:rPr>
+      </w:pPr>
+      <w:r>
+        <w:rPr>
+          <w:rFonts w:ascii="Times New Roman" w:hAnsi="Times New Roman" w:cs="Times New Roman"/>
+          <w:b/>
+          <w:bCs/>
+        </w:rPr>
+        <w:t>LEARNING &amp; GROWTH</w:t>
+      </w:r>
+    </w:p>
+    <w:p>
+      <w:pPr>
+        <w:numPr>
+          <w:ilvl w:val="0"/>
+          <w:numId w:val="11"/>
+        </w:numPr>
+        <w:rPr>
+          <w:rFonts w:ascii="Times New Roman" w:hAnsi="Times New Roman" w:cs="Times New Roman"/>
+          <w:b/>
+          <w:bCs/>
+        </w:rPr>
+      </w:pPr>
+      <w:r>
+        <w:rPr>
+          <w:rFonts w:ascii="Times New Roman" w:hAnsi="Times New Roman" w:cs="Times New Roman"/>
+          <w:b/>
+          <w:bCs/>
+        </w:rPr>
+        <w:t>Learned how to combine AI models with real system commands safely, which is a non-trivial challenge.</w:t>
+      </w:r>
+    </w:p>
+    <w:p>
+      <w:pPr>
+        <w:numPr>
+          <w:ilvl w:val="0"/>
+          <w:numId w:val="11"/>
+        </w:numPr>
+        <w:rPr>
+          <w:rFonts w:ascii="Times New Roman" w:hAnsi="Times New Roman" w:cs="Times New Roman"/>
+          <w:b/>
+          <w:bCs/>
+        </w:rPr>
+      </w:pPr>
+      <w:r>
+        <w:rPr>
+          <w:rFonts w:ascii="Times New Roman" w:hAnsi="Times New Roman" w:cs="Times New Roman"/>
+          <w:b/>
+          <w:bCs/>
+        </w:rPr>
+        <w:t xml:space="preserve">Grew skills in cluster administration, </w:t>
+      </w:r>
+      <w:proofErr w:type="spellStart"/>
+      <w:r>
+        <w:rPr>
+          <w:rFonts w:ascii="Times New Roman" w:hAnsi="Times New Roman" w:cs="Times New Roman"/>
+          <w:b/>
+          <w:bCs/>
+        </w:rPr>
+        <w:t>Slurm</w:t>
+      </w:r>
+      <w:proofErr w:type="spellEnd"/>
+      <w:r>
+        <w:rPr>
+          <w:rFonts w:ascii="Times New Roman" w:hAnsi="Times New Roman" w:cs="Times New Roman"/>
+          <w:b/>
+          <w:bCs/>
+        </w:rPr>
+        <w:t xml:space="preserve"> configuration, and container security.</w:t>
+      </w:r>
+    </w:p>
+    <w:p>
+      <w:pPr>
+        <w:numPr>
+          <w:ilvl w:val="0"/>
+          <w:numId w:val="11"/>
+        </w:numPr>
+        <w:rPr>
+          <w:rFonts w:ascii="Times New Roman" w:hAnsi="Times New Roman" w:cs="Times New Roman"/>
+          <w:b/>
+          <w:bCs/>
+        </w:rPr>
+      </w:pPr>
+      <w:r>
+        <w:rPr>
+          <w:rFonts w:ascii="Times New Roman" w:hAnsi="Times New Roman" w:cs="Times New Roman"/>
+          <w:b/>
+          <w:bCs/>
+        </w:rPr>
+        <w:t>Learned how to design a research-ready logging pipeline that can be used for statistical analysis and user-behavior studies.</w:t>
+      </w:r>
+    </w:p>
+    <w:p>
+      <w:pPr>
+        <w:rPr>
+          <w:rFonts w:ascii="Times New Roman" w:hAnsi="Times New Roman" w:cs="Times New Roman"/>
+          <w:b/>
+          <w:bCs/>
+        </w:rPr>
+      </w:pPr>
+      <w:r>
+        <w:rPr>
+          <w:rFonts w:ascii="Times New Roman" w:hAnsi="Times New Roman" w:cs="Times New Roman"/>
+          <w:b/>
+          <w:bCs/>
+        </w:rPr>
+        <w:pict w14:anchorId="6E289E83">
+          <v:rect id="_x0000_i1078" style="width:0;height:1.5pt" o:hralign="center" o:hrstd="t" o:hr="t" fillcolor="#a0a0a0" stroked="f"/>
+        </w:pict>
+      </w:r>
+    </w:p>
+    <w:p>
+      <w:pPr>
+        <w:rPr>
+          <w:rFonts w:ascii="Times New Roman" w:hAnsi="Times New Roman" w:cs="Times New Roman"/>
+          <w:b/>
+          <w:bCs/>
+        </w:rPr>
+      </w:pPr>
+      <w:r>
+        <w:rPr>
+          <w:rFonts w:ascii="Times New Roman" w:hAnsi="Times New Roman" w:cs="Times New Roman"/>
+          <w:b/>
+          <w:bCs/>
+        </w:rPr>
+        <w:t>REAL-WORLD APPLICATIONS</w:t>
+      </w:r>
+    </w:p>
+    <w:p>
+      <w:pPr>
+        <w:numPr>
+          <w:ilvl w:val="0"/>
+          <w:numId w:val="12"/>
+        </w:numPr>
+        <w:rPr>
+          <w:rFonts w:ascii="Times New Roman" w:hAnsi="Times New Roman" w:cs="Times New Roman"/>
+          <w:b/>
+          <w:bCs/>
+        </w:rPr>
+      </w:pPr>
+      <w:r>
+        <w:rPr>
+          <w:rFonts w:ascii="Times New Roman" w:hAnsi="Times New Roman" w:cs="Times New Roman"/>
+          <w:b/>
+          <w:bCs/>
+        </w:rPr>
+        <w:t xml:space="preserve">Universities and research labs constantly struggle onboarding beginners to HPC clusters. </w:t>
+      </w:r>
+      <w:proofErr w:type="spellStart"/>
+      <w:r>
+        <w:rPr>
+          <w:rFonts w:ascii="Times New Roman" w:hAnsi="Times New Roman" w:cs="Times New Roman"/>
+          <w:b/>
+          <w:bCs/>
+        </w:rPr>
+        <w:t>Inkly</w:t>
+      </w:r>
+      <w:proofErr w:type="spellEnd"/>
+      <w:r>
+        <w:rPr>
+          <w:rFonts w:ascii="Times New Roman" w:hAnsi="Times New Roman" w:cs="Times New Roman"/>
+          <w:b/>
+          <w:bCs/>
+        </w:rPr>
+        <w:t xml:space="preserve"> directly solves this.</w:t>
+      </w:r>
+    </w:p>
+    <w:p>
+      <w:pPr>
+        <w:numPr>
+          <w:ilvl w:val="0"/>
+          <w:numId w:val="12"/>
+        </w:numPr>
+        <w:rPr>
+          <w:rFonts w:ascii="Times New Roman" w:hAnsi="Times New Roman" w:cs="Times New Roman"/>
+          <w:b/>
+          <w:bCs/>
+        </w:rPr>
+      </w:pPr>
+      <w:r>
+        <w:rPr>
+          <w:rFonts w:ascii="Times New Roman" w:hAnsi="Times New Roman" w:cs="Times New Roman"/>
+          <w:b/>
+          <w:bCs/>
+        </w:rPr>
+        <w:t xml:space="preserve">Companies with internal </w:t>
+      </w:r>
+      <w:proofErr w:type="gramStart"/>
+      <w:r>
+        <w:rPr>
+          <w:rFonts w:ascii="Times New Roman" w:hAnsi="Times New Roman" w:cs="Times New Roman"/>
+          <w:b/>
+          <w:bCs/>
+        </w:rPr>
+        <w:t>compute</w:t>
+      </w:r>
+      <w:proofErr w:type="gramEnd"/>
+      <w:r>
+        <w:rPr>
+          <w:rFonts w:ascii="Times New Roman" w:hAnsi="Times New Roman" w:cs="Times New Roman"/>
+          <w:b/>
+          <w:bCs/>
+        </w:rPr>
+        <w:t xml:space="preserve"> clusters face similar problems—this tool can reduce training time and increase usability.</w:t>
+      </w:r>
+    </w:p>
+    <w:p>
+      <w:pPr>
+        <w:numPr>
+          <w:ilvl w:val="0"/>
+          <w:numId w:val="12"/>
+        </w:numPr>
+        <w:rPr>
+          <w:rFonts w:ascii="Times New Roman" w:hAnsi="Times New Roman" w:cs="Times New Roman"/>
+          <w:b/>
+          <w:bCs/>
+        </w:rPr>
+      </w:pPr>
+      <w:r>
+        <w:rPr>
+          <w:rFonts w:ascii="Times New Roman" w:hAnsi="Times New Roman" w:cs="Times New Roman"/>
+          <w:b/>
+          <w:bCs/>
+        </w:rPr>
+        <w:t>AI-assisted interfaces are becoming a major trend in DevOps, HPC, and cloud computing.</w:t>
+      </w:r>
+    </w:p>
+    <w:p>
+      <w:pPr>
+        <w:rPr>
+          <w:rFonts w:ascii="Times New Roman" w:hAnsi="Times New Roman" w:cs="Times New Roman"/>
+          <w:b/>
+          <w:bCs/>
+        </w:rPr>
+      </w:pPr>
+      <w:r>
+        <w:rPr>
+          <w:rFonts w:ascii="Times New Roman" w:hAnsi="Times New Roman" w:cs="Times New Roman"/>
+          <w:b/>
+          <w:bCs/>
+        </w:rPr>
+        <w:pict w14:anchorId="27560A92">
+          <v:rect id="_x0000_i1079" style="width:0;height:1.5pt" o:hralign="center" o:hrstd="t" o:hr="t" fillcolor="#a0a0a0" stroked="f"/>
+        </w:pict>
+      </w:r>
+    </w:p>
+    <w:p>
+      <w:pPr>
+        <w:rPr>
+          <w:rFonts w:ascii="Times New Roman" w:hAnsi="Times New Roman" w:cs="Times New Roman"/>
+          <w:b/>
+          <w:bCs/>
+        </w:rPr>
+      </w:pPr>
+      <w:r>
+        <w:rPr>
+          <w:rFonts w:ascii="Times New Roman" w:hAnsi="Times New Roman" w:cs="Times New Roman"/>
+          <w:b/>
+          <w:bCs/>
+        </w:rPr>
+        <w:lastRenderedPageBreak/>
+        <w:t>FUTURE IMPROVEMENTS</w:t>
+      </w:r>
+    </w:p>
+    <w:p>
+      <w:pPr>
+        <w:numPr>
+          <w:ilvl w:val="0"/>
+          <w:numId w:val="13"/>
+        </w:numPr>
+        <w:rPr>
+          <w:rFonts w:ascii="Times New Roman" w:hAnsi="Times New Roman" w:cs="Times New Roman"/>
+          <w:b/>
+          <w:bCs/>
+        </w:rPr>
+      </w:pPr>
+      <w:r>
+        <w:rPr>
+          <w:rFonts w:ascii="Times New Roman" w:hAnsi="Times New Roman" w:cs="Times New Roman"/>
+          <w:b/>
+          <w:bCs/>
+        </w:rPr>
+        <w:t>Automated job debugger that reads .out/.err files and provides explanations or fixes.</w:t>
+      </w:r>
+    </w:p>
+    <w:p>
+      <w:pPr>
+        <w:numPr>
+          <w:ilvl w:val="0"/>
+          <w:numId w:val="13"/>
+        </w:numPr>
+        <w:rPr>
+          <w:rFonts w:ascii="Times New Roman" w:hAnsi="Times New Roman" w:cs="Times New Roman"/>
+          <w:b/>
+          <w:bCs/>
+        </w:rPr>
+      </w:pPr>
+      <w:r>
+        <w:rPr>
+          <w:rFonts w:ascii="Times New Roman" w:hAnsi="Times New Roman" w:cs="Times New Roman"/>
+          <w:b/>
+          <w:bCs/>
+        </w:rPr>
+        <w:t>Smarter resource recommendations based on historical job performance data.</w:t>
+      </w:r>
+    </w:p>
+    <w:p>
+      <w:pPr>
+        <w:numPr>
+          <w:ilvl w:val="0"/>
+          <w:numId w:val="13"/>
+        </w:numPr>
+        <w:rPr>
+          <w:rFonts w:ascii="Times New Roman" w:hAnsi="Times New Roman" w:cs="Times New Roman"/>
+          <w:b/>
+          <w:bCs/>
+        </w:rPr>
+      </w:pPr>
+      <w:r>
+        <w:rPr>
+          <w:rFonts w:ascii="Times New Roman" w:hAnsi="Times New Roman" w:cs="Times New Roman"/>
+          <w:b/>
+          <w:bCs/>
+        </w:rPr>
+        <w:t>Domain-specific profiles (for example, a “marine biology” preset that knows common workflows).</w:t>
+      </w:r>
+    </w:p>
+    <w:p>
+      <w:pPr>
+        <w:numPr>
+          <w:ilvl w:val="0"/>
+          <w:numId w:val="13"/>
+        </w:numPr>
+        <w:rPr>
+          <w:rFonts w:ascii="Times New Roman" w:hAnsi="Times New Roman" w:cs="Times New Roman"/>
+          <w:b/>
+          <w:bCs/>
+        </w:rPr>
+      </w:pPr>
+      <w:r>
+        <w:rPr>
+          <w:rFonts w:ascii="Times New Roman" w:hAnsi="Times New Roman" w:cs="Times New Roman"/>
+          <w:b/>
+          <w:bCs/>
+        </w:rPr>
+        <w:t>Web dashboard for viewing logs, AI usage, and job success metrics.</w:t>
+      </w:r>
+    </w:p>
+    <w:p>
+      <w:pPr>
+        <w:rPr>
+          <w:rFonts w:ascii="Times New Roman" w:hAnsi="Times New Roman" w:cs="Times New Roman"/>
+          <w:b/>
+          <w:bCs/>
+        </w:rPr>
+      </w:pPr>
+      <w:r>
+        <w:rPr>
+          <w:rFonts w:ascii="Times New Roman" w:hAnsi="Times New Roman" w:cs="Times New Roman"/>
+          <w:b/>
+          <w:bCs/>
+        </w:rPr>
+        <w:pict w14:anchorId="2AE03AB6">
+          <v:rect id="_x0000_i1080" style="width:0;height:1.5pt" o:hralign="center" o:hrstd="t" o:hr="t" fillcolor="#a0a0a0" stroked="f"/>
+        </w:pict>
+      </w:r>
+    </w:p>
+    <w:p>
+      <w:pPr>
+        <w:rPr>
+          <w:rFonts w:ascii="Times New Roman" w:hAnsi="Times New Roman" w:cs="Times New Roman"/>
+          <w:b/>
+          <w:bCs/>
+        </w:rPr>
+      </w:pPr>
+      <w:r>
+        <w:rPr>
+          <w:rFonts w:ascii="Times New Roman" w:hAnsi="Times New Roman" w:cs="Times New Roman"/>
+          <w:b/>
+          <w:bCs/>
+        </w:rPr>
+        <w:t>CAREER CONNECTION</w:t>
+      </w:r>
+    </w:p>
+    <w:p>
+      <w:pPr>
+        <w:numPr>
+          <w:ilvl w:val="0"/>
+          <w:numId w:val="14"/>
+        </w:numPr>
+        <w:rPr>
+          <w:rFonts w:ascii="Times New Roman" w:hAnsi="Times New Roman" w:cs="Times New Roman"/>
+          <w:b/>
+          <w:bCs/>
+        </w:rPr>
+      </w:pPr>
+      <w:r>
+        <w:rPr>
+          <w:rFonts w:ascii="Times New Roman" w:hAnsi="Times New Roman" w:cs="Times New Roman"/>
+          <w:b/>
+          <w:bCs/>
+        </w:rPr>
+        <w:t>Directly aligns with HPC engineering, cloud computing, DevOps, AI tooling, and research computing careers.</w:t>
+      </w:r>
+    </w:p>
+    <w:p>
+      <w:pPr>
+        <w:numPr>
+          <w:ilvl w:val="0"/>
+          <w:numId w:val="14"/>
+        </w:numPr>
+        <w:rPr>
+          <w:rFonts w:ascii="Times New Roman" w:hAnsi="Times New Roman" w:cs="Times New Roman"/>
+          <w:b/>
+          <w:bCs/>
+        </w:rPr>
+      </w:pPr>
+      <w:r>
+        <w:rPr>
+          <w:rFonts w:ascii="Times New Roman" w:hAnsi="Times New Roman" w:cs="Times New Roman"/>
+          <w:b/>
+          <w:bCs/>
+        </w:rPr>
+        <w:t>Builds experience in automation, system tooling, secure containerization, and AI-assisted developer workflows.</w:t>
+      </w:r>
+    </w:p>
+    <w:p>
+      <w:pPr>
+        <w:numPr>
+          <w:ilvl w:val="0"/>
+          <w:numId w:val="14"/>
+        </w:numPr>
+        <w:rPr>
+          <w:rFonts w:ascii="Times New Roman" w:hAnsi="Times New Roman" w:cs="Times New Roman"/>
+          <w:b/>
+          <w:bCs/>
+        </w:rPr>
+      </w:pPr>
+      <w:r>
+        <w:rPr>
+          <w:rFonts w:ascii="Times New Roman" w:hAnsi="Times New Roman" w:cs="Times New Roman"/>
+          <w:b/>
+          <w:bCs/>
+        </w:rPr>
+        <w:t>This project prepares you for HPC system roles, AI infrastructure work, or software engineering positions focused on developer productivity.</w:t>
+      </w:r>
+    </w:p>
+    <w:p>
+      <w:pPr>
+        <w:rPr>
+          <w:rFonts w:ascii="Times New Roman" w:hAnsi="Times New Roman" w:cs="Times New Roman"/>
+          <w:b/>
+          <w:bCs/>
         </w:rPr>
       </w:pPr>
     </w:p>
@@ -1279,8 +2795,13 @@
       </w:tabs>
     </w:pPr>
     <w:r>
-      <w:t>Ryan Varhas</w:t>
+      <w:t xml:space="preserve">Ryan </w:t>
     </w:r>
+    <w:proofErr w:type="spellStart"/>
+    <w:r>
+      <w:t>Varhas</w:t>
+    </w:r>
+    <w:proofErr w:type="spellEnd"/>
     <w:r>
       <w:tab/>
       <w:t>Showcase Draft</w:t>
@@ -1292,6 +2813,900 @@
 <file path=word/numbering.xml><?xml version="1.0" encoding="utf-8"?>
 <w:numbering xmlns:wpc="http://schemas.microsoft.com/office/word/2010/wordprocessingCanvas" xmlns:cx="http://schemas.microsoft.com/office/drawing/2014/chartex" xmlns:cx1="http://schemas.microsoft.com/office/drawing/2015/9/8/chartex" xmlns:cx2="http://schemas.microsoft.com/office/drawing/2015/10/21/chartex" xmlns:cx3="http://schemas.microsoft.com/office/drawing/2016/5/9/chartex" xmlns:cx4="http://schemas.microsoft.com/office/drawing/2016/5/10/chartex" xmlns:cx5="http://schemas.microsoft.com/office/drawing/2016/5/11/chartex" xmlns:cx6="http://schemas.microsoft.com/office/drawing/2016/5/12/chartex" xmlns:cx7="http://schemas.microsoft.com/office/drawing/2016/5/13/chartex" xmlns:cx8="http://schemas.microsoft.com/office/drawing/2016/5/14/chartex" xmlns:mc="http://schemas.openxmlformats.org/markup-compatibility/2006" xmlns:aink="http://schemas.microsoft.com/office/drawing/2016/ink" xmlns:am3d="http://schemas.microsoft.com/office/drawing/2017/model3d" xmlns:o="urn:schemas-microsoft-com:office:office" xmlns:oel="http://schemas.microsoft.com/office/2019/extlst" xmlns:r="http://schemas.openxmlformats.org/officeDocument/2006/relationships" xmlns:m="http://schemas.openxmlformats.org/officeDocument/2006/math" xmlns:v="urn:schemas-microsoft-com:vml" xmlns:wp14="http://schemas.microsoft.com/office/word/2010/wordprocessingDrawing" xmlns:wp="http://schemas.openxmlformats.org/drawingml/2006/wordprocessingDrawing" xmlns:w10="urn:schemas-microsoft-com:office:word" xmlns:w="http://schemas.openxmlformats.org/wordprocessingml/2006/main" xmlns:w14="http://schemas.microsoft.com/office/word/2010/wordml" xmlns:w15="http://schemas.microsoft.com/office/word/2012/wordml" xmlns:w16cex="http://schemas.microsoft.com/office/word/2018/wordml/cex" xmlns:w16cid="http://schemas.microsoft.com/office/word/2016/wordml/cid" xmlns:w16="http://schemas.microsoft.com/office/word/2018/wordml" xmlns:w16du="http://schemas.microsoft.com/office/word/2023/wordml/word16du" xmlns:w16sdtdh="http://schemas.microsoft.com/office/word/2020/wordml/sdtdatahash" xmlns:w16sdtfl="http://schemas.microsoft.com/office/word/2024/wordml/sdtformatlock" xmlns:w16se="http://schemas.microsoft.com/office/word/2015/wordml/symex" xmlns:wpg="http://schemas.microsoft.com/office/word/2010/wordprocessingGroup" xmlns:wpi="http://schemas.microsoft.com/office/word/2010/wordprocessingInk" xmlns:wne="http://schemas.microsoft.com/office/word/2006/wordml" xmlns:wps="http://schemas.microsoft.com/office/word/2010/wordprocessingShape" mc:Ignorable="w14 w15 w16se w16cid w16 w16cex w16sdtdh w16sdtfl w16du wp14">
   <w:abstractNum w:abstractNumId="0" w15:restartNumberingAfterBreak="0">
+    <w:nsid w:val="0F4A41C7"/>
+    <w:multiLevelType w:val="multilevel"/>
+    <w:tmpl w:val="7AB859B6"/>
+    <w:lvl w:ilvl="0">
+      <w:start w:val="1"/>
+      <w:numFmt w:val="bullet"/>
+      <w:lvlText w:val=""/>
+      <w:lvlJc w:val="left"/>
+      <w:pPr>
+        <w:tabs>
+          <w:tab w:val="num" w:pos="720"/>
+        </w:tabs>
+        <w:ind w:left="720" w:hanging="360"/>
+      </w:pPr>
+      <w:rPr>
+        <w:rFonts w:ascii="Symbol" w:hAnsi="Symbol" w:hint="default"/>
+        <w:sz w:val="20"/>
+      </w:rPr>
+    </w:lvl>
+    <w:lvl w:ilvl="1" w:tentative="1">
+      <w:start w:val="1"/>
+      <w:numFmt w:val="bullet"/>
+      <w:lvlText w:val="o"/>
+      <w:lvlJc w:val="left"/>
+      <w:pPr>
+        <w:tabs>
+          <w:tab w:val="num" w:pos="1440"/>
+        </w:tabs>
+        <w:ind w:left="1440" w:hanging="360"/>
+      </w:pPr>
+      <w:rPr>
+        <w:rFonts w:ascii="Courier New" w:hAnsi="Courier New" w:hint="default"/>
+        <w:sz w:val="20"/>
+      </w:rPr>
+    </w:lvl>
+    <w:lvl w:ilvl="2" w:tentative="1">
+      <w:start w:val="1"/>
+      <w:numFmt w:val="bullet"/>
+      <w:lvlText w:val=""/>
+      <w:lvlJc w:val="left"/>
+      <w:pPr>
+        <w:tabs>
+          <w:tab w:val="num" w:pos="2160"/>
+        </w:tabs>
+        <w:ind w:left="2160" w:hanging="360"/>
+      </w:pPr>
+      <w:rPr>
+        <w:rFonts w:ascii="Wingdings" w:hAnsi="Wingdings" w:hint="default"/>
+        <w:sz w:val="20"/>
+      </w:rPr>
+    </w:lvl>
+    <w:lvl w:ilvl="3" w:tentative="1">
+      <w:start w:val="1"/>
+      <w:numFmt w:val="bullet"/>
+      <w:lvlText w:val=""/>
+      <w:lvlJc w:val="left"/>
+      <w:pPr>
+        <w:tabs>
+          <w:tab w:val="num" w:pos="2880"/>
+        </w:tabs>
+        <w:ind w:left="2880" w:hanging="360"/>
+      </w:pPr>
+      <w:rPr>
+        <w:rFonts w:ascii="Wingdings" w:hAnsi="Wingdings" w:hint="default"/>
+        <w:sz w:val="20"/>
+      </w:rPr>
+    </w:lvl>
+    <w:lvl w:ilvl="4" w:tentative="1">
+      <w:start w:val="1"/>
+      <w:numFmt w:val="bullet"/>
+      <w:lvlText w:val=""/>
+      <w:lvlJc w:val="left"/>
+      <w:pPr>
+        <w:tabs>
+          <w:tab w:val="num" w:pos="3600"/>
+        </w:tabs>
+        <w:ind w:left="3600" w:hanging="360"/>
+      </w:pPr>
+      <w:rPr>
+        <w:rFonts w:ascii="Wingdings" w:hAnsi="Wingdings" w:hint="default"/>
+        <w:sz w:val="20"/>
+      </w:rPr>
+    </w:lvl>
+    <w:lvl w:ilvl="5" w:tentative="1">
+      <w:start w:val="1"/>
+      <w:numFmt w:val="bullet"/>
+      <w:lvlText w:val=""/>
+      <w:lvlJc w:val="left"/>
+      <w:pPr>
+        <w:tabs>
+          <w:tab w:val="num" w:pos="4320"/>
+        </w:tabs>
+        <w:ind w:left="4320" w:hanging="360"/>
+      </w:pPr>
+      <w:rPr>
+        <w:rFonts w:ascii="Wingdings" w:hAnsi="Wingdings" w:hint="default"/>
+        <w:sz w:val="20"/>
+      </w:rPr>
+    </w:lvl>
+    <w:lvl w:ilvl="6" w:tentative="1">
+      <w:start w:val="1"/>
+      <w:numFmt w:val="bullet"/>
+      <w:lvlText w:val=""/>
+      <w:lvlJc w:val="left"/>
+      <w:pPr>
+        <w:tabs>
+          <w:tab w:val="num" w:pos="5040"/>
+        </w:tabs>
+        <w:ind w:left="5040" w:hanging="360"/>
+      </w:pPr>
+      <w:rPr>
+        <w:rFonts w:ascii="Wingdings" w:hAnsi="Wingdings" w:hint="default"/>
+        <w:sz w:val="20"/>
+      </w:rPr>
+    </w:lvl>
+    <w:lvl w:ilvl="7" w:tentative="1">
+      <w:start w:val="1"/>
+      <w:numFmt w:val="bullet"/>
+      <w:lvlText w:val=""/>
+      <w:lvlJc w:val="left"/>
+      <w:pPr>
+        <w:tabs>
+          <w:tab w:val="num" w:pos="5760"/>
+        </w:tabs>
+        <w:ind w:left="5760" w:hanging="360"/>
+      </w:pPr>
+      <w:rPr>
+        <w:rFonts w:ascii="Wingdings" w:hAnsi="Wingdings" w:hint="default"/>
+        <w:sz w:val="20"/>
+      </w:rPr>
+    </w:lvl>
+    <w:lvl w:ilvl="8" w:tentative="1">
+      <w:start w:val="1"/>
+      <w:numFmt w:val="bullet"/>
+      <w:lvlText w:val=""/>
+      <w:lvlJc w:val="left"/>
+      <w:pPr>
+        <w:tabs>
+          <w:tab w:val="num" w:pos="6480"/>
+        </w:tabs>
+        <w:ind w:left="6480" w:hanging="360"/>
+      </w:pPr>
+      <w:rPr>
+        <w:rFonts w:ascii="Wingdings" w:hAnsi="Wingdings" w:hint="default"/>
+        <w:sz w:val="20"/>
+      </w:rPr>
+    </w:lvl>
+  </w:abstractNum>
+  <w:abstractNum w:abstractNumId="1" w15:restartNumberingAfterBreak="0">
+    <w:nsid w:val="1136685E"/>
+    <w:multiLevelType w:val="multilevel"/>
+    <w:tmpl w:val="7982EBE6"/>
+    <w:lvl w:ilvl="0">
+      <w:start w:val="1"/>
+      <w:numFmt w:val="bullet"/>
+      <w:lvlText w:val=""/>
+      <w:lvlJc w:val="left"/>
+      <w:pPr>
+        <w:tabs>
+          <w:tab w:val="num" w:pos="720"/>
+        </w:tabs>
+        <w:ind w:left="720" w:hanging="360"/>
+      </w:pPr>
+      <w:rPr>
+        <w:rFonts w:ascii="Symbol" w:hAnsi="Symbol" w:hint="default"/>
+        <w:sz w:val="20"/>
+      </w:rPr>
+    </w:lvl>
+    <w:lvl w:ilvl="1" w:tentative="1">
+      <w:start w:val="1"/>
+      <w:numFmt w:val="bullet"/>
+      <w:lvlText w:val="o"/>
+      <w:lvlJc w:val="left"/>
+      <w:pPr>
+        <w:tabs>
+          <w:tab w:val="num" w:pos="1440"/>
+        </w:tabs>
+        <w:ind w:left="1440" w:hanging="360"/>
+      </w:pPr>
+      <w:rPr>
+        <w:rFonts w:ascii="Courier New" w:hAnsi="Courier New" w:hint="default"/>
+        <w:sz w:val="20"/>
+      </w:rPr>
+    </w:lvl>
+    <w:lvl w:ilvl="2" w:tentative="1">
+      <w:start w:val="1"/>
+      <w:numFmt w:val="bullet"/>
+      <w:lvlText w:val=""/>
+      <w:lvlJc w:val="left"/>
+      <w:pPr>
+        <w:tabs>
+          <w:tab w:val="num" w:pos="2160"/>
+        </w:tabs>
+        <w:ind w:left="2160" w:hanging="360"/>
+      </w:pPr>
+      <w:rPr>
+        <w:rFonts w:ascii="Wingdings" w:hAnsi="Wingdings" w:hint="default"/>
+        <w:sz w:val="20"/>
+      </w:rPr>
+    </w:lvl>
+    <w:lvl w:ilvl="3" w:tentative="1">
+      <w:start w:val="1"/>
+      <w:numFmt w:val="bullet"/>
+      <w:lvlText w:val=""/>
+      <w:lvlJc w:val="left"/>
+      <w:pPr>
+        <w:tabs>
+          <w:tab w:val="num" w:pos="2880"/>
+        </w:tabs>
+        <w:ind w:left="2880" w:hanging="360"/>
+      </w:pPr>
+      <w:rPr>
+        <w:rFonts w:ascii="Wingdings" w:hAnsi="Wingdings" w:hint="default"/>
+        <w:sz w:val="20"/>
+      </w:rPr>
+    </w:lvl>
+    <w:lvl w:ilvl="4" w:tentative="1">
+      <w:start w:val="1"/>
+      <w:numFmt w:val="bullet"/>
+      <w:lvlText w:val=""/>
+      <w:lvlJc w:val="left"/>
+      <w:pPr>
+        <w:tabs>
+          <w:tab w:val="num" w:pos="3600"/>
+        </w:tabs>
+        <w:ind w:left="3600" w:hanging="360"/>
+      </w:pPr>
+      <w:rPr>
+        <w:rFonts w:ascii="Wingdings" w:hAnsi="Wingdings" w:hint="default"/>
+        <w:sz w:val="20"/>
+      </w:rPr>
+    </w:lvl>
+    <w:lvl w:ilvl="5" w:tentative="1">
+      <w:start w:val="1"/>
+      <w:numFmt w:val="bullet"/>
+      <w:lvlText w:val=""/>
+      <w:lvlJc w:val="left"/>
+      <w:pPr>
+        <w:tabs>
+          <w:tab w:val="num" w:pos="4320"/>
+        </w:tabs>
+        <w:ind w:left="4320" w:hanging="360"/>
+      </w:pPr>
+      <w:rPr>
+        <w:rFonts w:ascii="Wingdings" w:hAnsi="Wingdings" w:hint="default"/>
+        <w:sz w:val="20"/>
+      </w:rPr>
+    </w:lvl>
+    <w:lvl w:ilvl="6" w:tentative="1">
+      <w:start w:val="1"/>
+      <w:numFmt w:val="bullet"/>
+      <w:lvlText w:val=""/>
+      <w:lvlJc w:val="left"/>
+      <w:pPr>
+        <w:tabs>
+          <w:tab w:val="num" w:pos="5040"/>
+        </w:tabs>
+        <w:ind w:left="5040" w:hanging="360"/>
+      </w:pPr>
+      <w:rPr>
+        <w:rFonts w:ascii="Wingdings" w:hAnsi="Wingdings" w:hint="default"/>
+        <w:sz w:val="20"/>
+      </w:rPr>
+    </w:lvl>
+    <w:lvl w:ilvl="7" w:tentative="1">
+      <w:start w:val="1"/>
+      <w:numFmt w:val="bullet"/>
+      <w:lvlText w:val=""/>
+      <w:lvlJc w:val="left"/>
+      <w:pPr>
+        <w:tabs>
+          <w:tab w:val="num" w:pos="5760"/>
+        </w:tabs>
+        <w:ind w:left="5760" w:hanging="360"/>
+      </w:pPr>
+      <w:rPr>
+        <w:rFonts w:ascii="Wingdings" w:hAnsi="Wingdings" w:hint="default"/>
+        <w:sz w:val="20"/>
+      </w:rPr>
+    </w:lvl>
+    <w:lvl w:ilvl="8" w:tentative="1">
+      <w:start w:val="1"/>
+      <w:numFmt w:val="bullet"/>
+      <w:lvlText w:val=""/>
+      <w:lvlJc w:val="left"/>
+      <w:pPr>
+        <w:tabs>
+          <w:tab w:val="num" w:pos="6480"/>
+        </w:tabs>
+        <w:ind w:left="6480" w:hanging="360"/>
+      </w:pPr>
+      <w:rPr>
+        <w:rFonts w:ascii="Wingdings" w:hAnsi="Wingdings" w:hint="default"/>
+        <w:sz w:val="20"/>
+      </w:rPr>
+    </w:lvl>
+  </w:abstractNum>
+  <w:abstractNum w:abstractNumId="2" w15:restartNumberingAfterBreak="0">
+    <w:nsid w:val="178E65E4"/>
+    <w:multiLevelType w:val="multilevel"/>
+    <w:tmpl w:val="76E0EA40"/>
+    <w:lvl w:ilvl="0">
+      <w:start w:val="1"/>
+      <w:numFmt w:val="bullet"/>
+      <w:lvlText w:val=""/>
+      <w:lvlJc w:val="left"/>
+      <w:pPr>
+        <w:tabs>
+          <w:tab w:val="num" w:pos="720"/>
+        </w:tabs>
+        <w:ind w:left="720" w:hanging="360"/>
+      </w:pPr>
+      <w:rPr>
+        <w:rFonts w:ascii="Symbol" w:hAnsi="Symbol" w:hint="default"/>
+        <w:sz w:val="20"/>
+      </w:rPr>
+    </w:lvl>
+    <w:lvl w:ilvl="1" w:tentative="1">
+      <w:start w:val="1"/>
+      <w:numFmt w:val="bullet"/>
+      <w:lvlText w:val="o"/>
+      <w:lvlJc w:val="left"/>
+      <w:pPr>
+        <w:tabs>
+          <w:tab w:val="num" w:pos="1440"/>
+        </w:tabs>
+        <w:ind w:left="1440" w:hanging="360"/>
+      </w:pPr>
+      <w:rPr>
+        <w:rFonts w:ascii="Courier New" w:hAnsi="Courier New" w:hint="default"/>
+        <w:sz w:val="20"/>
+      </w:rPr>
+    </w:lvl>
+    <w:lvl w:ilvl="2" w:tentative="1">
+      <w:start w:val="1"/>
+      <w:numFmt w:val="bullet"/>
+      <w:lvlText w:val=""/>
+      <w:lvlJc w:val="left"/>
+      <w:pPr>
+        <w:tabs>
+          <w:tab w:val="num" w:pos="2160"/>
+        </w:tabs>
+        <w:ind w:left="2160" w:hanging="360"/>
+      </w:pPr>
+      <w:rPr>
+        <w:rFonts w:ascii="Wingdings" w:hAnsi="Wingdings" w:hint="default"/>
+        <w:sz w:val="20"/>
+      </w:rPr>
+    </w:lvl>
+    <w:lvl w:ilvl="3" w:tentative="1">
+      <w:start w:val="1"/>
+      <w:numFmt w:val="bullet"/>
+      <w:lvlText w:val=""/>
+      <w:lvlJc w:val="left"/>
+      <w:pPr>
+        <w:tabs>
+          <w:tab w:val="num" w:pos="2880"/>
+        </w:tabs>
+        <w:ind w:left="2880" w:hanging="360"/>
+      </w:pPr>
+      <w:rPr>
+        <w:rFonts w:ascii="Wingdings" w:hAnsi="Wingdings" w:hint="default"/>
+        <w:sz w:val="20"/>
+      </w:rPr>
+    </w:lvl>
+    <w:lvl w:ilvl="4" w:tentative="1">
+      <w:start w:val="1"/>
+      <w:numFmt w:val="bullet"/>
+      <w:lvlText w:val=""/>
+      <w:lvlJc w:val="left"/>
+      <w:pPr>
+        <w:tabs>
+          <w:tab w:val="num" w:pos="3600"/>
+        </w:tabs>
+        <w:ind w:left="3600" w:hanging="360"/>
+      </w:pPr>
+      <w:rPr>
+        <w:rFonts w:ascii="Wingdings" w:hAnsi="Wingdings" w:hint="default"/>
+        <w:sz w:val="20"/>
+      </w:rPr>
+    </w:lvl>
+    <w:lvl w:ilvl="5" w:tentative="1">
+      <w:start w:val="1"/>
+      <w:numFmt w:val="bullet"/>
+      <w:lvlText w:val=""/>
+      <w:lvlJc w:val="left"/>
+      <w:pPr>
+        <w:tabs>
+          <w:tab w:val="num" w:pos="4320"/>
+        </w:tabs>
+        <w:ind w:left="4320" w:hanging="360"/>
+      </w:pPr>
+      <w:rPr>
+        <w:rFonts w:ascii="Wingdings" w:hAnsi="Wingdings" w:hint="default"/>
+        <w:sz w:val="20"/>
+      </w:rPr>
+    </w:lvl>
+    <w:lvl w:ilvl="6" w:tentative="1">
+      <w:start w:val="1"/>
+      <w:numFmt w:val="bullet"/>
+      <w:lvlText w:val=""/>
+      <w:lvlJc w:val="left"/>
+      <w:pPr>
+        <w:tabs>
+          <w:tab w:val="num" w:pos="5040"/>
+        </w:tabs>
+        <w:ind w:left="5040" w:hanging="360"/>
+      </w:pPr>
+      <w:rPr>
+        <w:rFonts w:ascii="Wingdings" w:hAnsi="Wingdings" w:hint="default"/>
+        <w:sz w:val="20"/>
+      </w:rPr>
+    </w:lvl>
+    <w:lvl w:ilvl="7" w:tentative="1">
+      <w:start w:val="1"/>
+      <w:numFmt w:val="bullet"/>
+      <w:lvlText w:val=""/>
+      <w:lvlJc w:val="left"/>
+      <w:pPr>
+        <w:tabs>
+          <w:tab w:val="num" w:pos="5760"/>
+        </w:tabs>
+        <w:ind w:left="5760" w:hanging="360"/>
+      </w:pPr>
+      <w:rPr>
+        <w:rFonts w:ascii="Wingdings" w:hAnsi="Wingdings" w:hint="default"/>
+        <w:sz w:val="20"/>
+      </w:rPr>
+    </w:lvl>
+    <w:lvl w:ilvl="8" w:tentative="1">
+      <w:start w:val="1"/>
+      <w:numFmt w:val="bullet"/>
+      <w:lvlText w:val=""/>
+      <w:lvlJc w:val="left"/>
+      <w:pPr>
+        <w:tabs>
+          <w:tab w:val="num" w:pos="6480"/>
+        </w:tabs>
+        <w:ind w:left="6480" w:hanging="360"/>
+      </w:pPr>
+      <w:rPr>
+        <w:rFonts w:ascii="Wingdings" w:hAnsi="Wingdings" w:hint="default"/>
+        <w:sz w:val="20"/>
+      </w:rPr>
+    </w:lvl>
+  </w:abstractNum>
+  <w:abstractNum w:abstractNumId="3" w15:restartNumberingAfterBreak="0">
+    <w:nsid w:val="1E2C2A9F"/>
+    <w:multiLevelType w:val="multilevel"/>
+    <w:tmpl w:val="AFC46F32"/>
+    <w:lvl w:ilvl="0">
+      <w:start w:val="1"/>
+      <w:numFmt w:val="bullet"/>
+      <w:lvlText w:val=""/>
+      <w:lvlJc w:val="left"/>
+      <w:pPr>
+        <w:tabs>
+          <w:tab w:val="num" w:pos="720"/>
+        </w:tabs>
+        <w:ind w:left="720" w:hanging="360"/>
+      </w:pPr>
+      <w:rPr>
+        <w:rFonts w:ascii="Symbol" w:hAnsi="Symbol" w:hint="default"/>
+        <w:sz w:val="20"/>
+      </w:rPr>
+    </w:lvl>
+    <w:lvl w:ilvl="1" w:tentative="1">
+      <w:start w:val="1"/>
+      <w:numFmt w:val="bullet"/>
+      <w:lvlText w:val="o"/>
+      <w:lvlJc w:val="left"/>
+      <w:pPr>
+        <w:tabs>
+          <w:tab w:val="num" w:pos="1440"/>
+        </w:tabs>
+        <w:ind w:left="1440" w:hanging="360"/>
+      </w:pPr>
+      <w:rPr>
+        <w:rFonts w:ascii="Courier New" w:hAnsi="Courier New" w:hint="default"/>
+        <w:sz w:val="20"/>
+      </w:rPr>
+    </w:lvl>
+    <w:lvl w:ilvl="2" w:tentative="1">
+      <w:start w:val="1"/>
+      <w:numFmt w:val="bullet"/>
+      <w:lvlText w:val=""/>
+      <w:lvlJc w:val="left"/>
+      <w:pPr>
+        <w:tabs>
+          <w:tab w:val="num" w:pos="2160"/>
+        </w:tabs>
+        <w:ind w:left="2160" w:hanging="360"/>
+      </w:pPr>
+      <w:rPr>
+        <w:rFonts w:ascii="Wingdings" w:hAnsi="Wingdings" w:hint="default"/>
+        <w:sz w:val="20"/>
+      </w:rPr>
+    </w:lvl>
+    <w:lvl w:ilvl="3" w:tentative="1">
+      <w:start w:val="1"/>
+      <w:numFmt w:val="bullet"/>
+      <w:lvlText w:val=""/>
+      <w:lvlJc w:val="left"/>
+      <w:pPr>
+        <w:tabs>
+          <w:tab w:val="num" w:pos="2880"/>
+        </w:tabs>
+        <w:ind w:left="2880" w:hanging="360"/>
+      </w:pPr>
+      <w:rPr>
+        <w:rFonts w:ascii="Wingdings" w:hAnsi="Wingdings" w:hint="default"/>
+        <w:sz w:val="20"/>
+      </w:rPr>
+    </w:lvl>
+    <w:lvl w:ilvl="4" w:tentative="1">
+      <w:start w:val="1"/>
+      <w:numFmt w:val="bullet"/>
+      <w:lvlText w:val=""/>
+      <w:lvlJc w:val="left"/>
+      <w:pPr>
+        <w:tabs>
+          <w:tab w:val="num" w:pos="3600"/>
+        </w:tabs>
+        <w:ind w:left="3600" w:hanging="360"/>
+      </w:pPr>
+      <w:rPr>
+        <w:rFonts w:ascii="Wingdings" w:hAnsi="Wingdings" w:hint="default"/>
+        <w:sz w:val="20"/>
+      </w:rPr>
+    </w:lvl>
+    <w:lvl w:ilvl="5" w:tentative="1">
+      <w:start w:val="1"/>
+      <w:numFmt w:val="bullet"/>
+      <w:lvlText w:val=""/>
+      <w:lvlJc w:val="left"/>
+      <w:pPr>
+        <w:tabs>
+          <w:tab w:val="num" w:pos="4320"/>
+        </w:tabs>
+        <w:ind w:left="4320" w:hanging="360"/>
+      </w:pPr>
+      <w:rPr>
+        <w:rFonts w:ascii="Wingdings" w:hAnsi="Wingdings" w:hint="default"/>
+        <w:sz w:val="20"/>
+      </w:rPr>
+    </w:lvl>
+    <w:lvl w:ilvl="6" w:tentative="1">
+      <w:start w:val="1"/>
+      <w:numFmt w:val="bullet"/>
+      <w:lvlText w:val=""/>
+      <w:lvlJc w:val="left"/>
+      <w:pPr>
+        <w:tabs>
+          <w:tab w:val="num" w:pos="5040"/>
+        </w:tabs>
+        <w:ind w:left="5040" w:hanging="360"/>
+      </w:pPr>
+      <w:rPr>
+        <w:rFonts w:ascii="Wingdings" w:hAnsi="Wingdings" w:hint="default"/>
+        <w:sz w:val="20"/>
+      </w:rPr>
+    </w:lvl>
+    <w:lvl w:ilvl="7" w:tentative="1">
+      <w:start w:val="1"/>
+      <w:numFmt w:val="bullet"/>
+      <w:lvlText w:val=""/>
+      <w:lvlJc w:val="left"/>
+      <w:pPr>
+        <w:tabs>
+          <w:tab w:val="num" w:pos="5760"/>
+        </w:tabs>
+        <w:ind w:left="5760" w:hanging="360"/>
+      </w:pPr>
+      <w:rPr>
+        <w:rFonts w:ascii="Wingdings" w:hAnsi="Wingdings" w:hint="default"/>
+        <w:sz w:val="20"/>
+      </w:rPr>
+    </w:lvl>
+    <w:lvl w:ilvl="8" w:tentative="1">
+      <w:start w:val="1"/>
+      <w:numFmt w:val="bullet"/>
+      <w:lvlText w:val=""/>
+      <w:lvlJc w:val="left"/>
+      <w:pPr>
+        <w:tabs>
+          <w:tab w:val="num" w:pos="6480"/>
+        </w:tabs>
+        <w:ind w:left="6480" w:hanging="360"/>
+      </w:pPr>
+      <w:rPr>
+        <w:rFonts w:ascii="Wingdings" w:hAnsi="Wingdings" w:hint="default"/>
+        <w:sz w:val="20"/>
+      </w:rPr>
+    </w:lvl>
+  </w:abstractNum>
+  <w:abstractNum w:abstractNumId="4" w15:restartNumberingAfterBreak="0">
+    <w:nsid w:val="26A24C7B"/>
+    <w:multiLevelType w:val="multilevel"/>
+    <w:tmpl w:val="8A4E6D82"/>
+    <w:lvl w:ilvl="0">
+      <w:start w:val="1"/>
+      <w:numFmt w:val="bullet"/>
+      <w:lvlText w:val=""/>
+      <w:lvlJc w:val="left"/>
+      <w:pPr>
+        <w:tabs>
+          <w:tab w:val="num" w:pos="720"/>
+        </w:tabs>
+        <w:ind w:left="720" w:hanging="360"/>
+      </w:pPr>
+      <w:rPr>
+        <w:rFonts w:ascii="Symbol" w:hAnsi="Symbol" w:hint="default"/>
+        <w:sz w:val="20"/>
+      </w:rPr>
+    </w:lvl>
+    <w:lvl w:ilvl="1" w:tentative="1">
+      <w:start w:val="1"/>
+      <w:numFmt w:val="bullet"/>
+      <w:lvlText w:val="o"/>
+      <w:lvlJc w:val="left"/>
+      <w:pPr>
+        <w:tabs>
+          <w:tab w:val="num" w:pos="1440"/>
+        </w:tabs>
+        <w:ind w:left="1440" w:hanging="360"/>
+      </w:pPr>
+      <w:rPr>
+        <w:rFonts w:ascii="Courier New" w:hAnsi="Courier New" w:hint="default"/>
+        <w:sz w:val="20"/>
+      </w:rPr>
+    </w:lvl>
+    <w:lvl w:ilvl="2" w:tentative="1">
+      <w:start w:val="1"/>
+      <w:numFmt w:val="bullet"/>
+      <w:lvlText w:val=""/>
+      <w:lvlJc w:val="left"/>
+      <w:pPr>
+        <w:tabs>
+          <w:tab w:val="num" w:pos="2160"/>
+        </w:tabs>
+        <w:ind w:left="2160" w:hanging="360"/>
+      </w:pPr>
+      <w:rPr>
+        <w:rFonts w:ascii="Wingdings" w:hAnsi="Wingdings" w:hint="default"/>
+        <w:sz w:val="20"/>
+      </w:rPr>
+    </w:lvl>
+    <w:lvl w:ilvl="3" w:tentative="1">
+      <w:start w:val="1"/>
+      <w:numFmt w:val="bullet"/>
+      <w:lvlText w:val=""/>
+      <w:lvlJc w:val="left"/>
+      <w:pPr>
+        <w:tabs>
+          <w:tab w:val="num" w:pos="2880"/>
+        </w:tabs>
+        <w:ind w:left="2880" w:hanging="360"/>
+      </w:pPr>
+      <w:rPr>
+        <w:rFonts w:ascii="Wingdings" w:hAnsi="Wingdings" w:hint="default"/>
+        <w:sz w:val="20"/>
+      </w:rPr>
+    </w:lvl>
+    <w:lvl w:ilvl="4" w:tentative="1">
+      <w:start w:val="1"/>
+      <w:numFmt w:val="bullet"/>
+      <w:lvlText w:val=""/>
+      <w:lvlJc w:val="left"/>
+      <w:pPr>
+        <w:tabs>
+          <w:tab w:val="num" w:pos="3600"/>
+        </w:tabs>
+        <w:ind w:left="3600" w:hanging="360"/>
+      </w:pPr>
+      <w:rPr>
+        <w:rFonts w:ascii="Wingdings" w:hAnsi="Wingdings" w:hint="default"/>
+        <w:sz w:val="20"/>
+      </w:rPr>
+    </w:lvl>
+    <w:lvl w:ilvl="5" w:tentative="1">
+      <w:start w:val="1"/>
+      <w:numFmt w:val="bullet"/>
+      <w:lvlText w:val=""/>
+      <w:lvlJc w:val="left"/>
+      <w:pPr>
+        <w:tabs>
+          <w:tab w:val="num" w:pos="4320"/>
+        </w:tabs>
+        <w:ind w:left="4320" w:hanging="360"/>
+      </w:pPr>
+      <w:rPr>
+        <w:rFonts w:ascii="Wingdings" w:hAnsi="Wingdings" w:hint="default"/>
+        <w:sz w:val="20"/>
+      </w:rPr>
+    </w:lvl>
+    <w:lvl w:ilvl="6" w:tentative="1">
+      <w:start w:val="1"/>
+      <w:numFmt w:val="bullet"/>
+      <w:lvlText w:val=""/>
+      <w:lvlJc w:val="left"/>
+      <w:pPr>
+        <w:tabs>
+          <w:tab w:val="num" w:pos="5040"/>
+        </w:tabs>
+        <w:ind w:left="5040" w:hanging="360"/>
+      </w:pPr>
+      <w:rPr>
+        <w:rFonts w:ascii="Wingdings" w:hAnsi="Wingdings" w:hint="default"/>
+        <w:sz w:val="20"/>
+      </w:rPr>
+    </w:lvl>
+    <w:lvl w:ilvl="7" w:tentative="1">
+      <w:start w:val="1"/>
+      <w:numFmt w:val="bullet"/>
+      <w:lvlText w:val=""/>
+      <w:lvlJc w:val="left"/>
+      <w:pPr>
+        <w:tabs>
+          <w:tab w:val="num" w:pos="5760"/>
+        </w:tabs>
+        <w:ind w:left="5760" w:hanging="360"/>
+      </w:pPr>
+      <w:rPr>
+        <w:rFonts w:ascii="Wingdings" w:hAnsi="Wingdings" w:hint="default"/>
+        <w:sz w:val="20"/>
+      </w:rPr>
+    </w:lvl>
+    <w:lvl w:ilvl="8" w:tentative="1">
+      <w:start w:val="1"/>
+      <w:numFmt w:val="bullet"/>
+      <w:lvlText w:val=""/>
+      <w:lvlJc w:val="left"/>
+      <w:pPr>
+        <w:tabs>
+          <w:tab w:val="num" w:pos="6480"/>
+        </w:tabs>
+        <w:ind w:left="6480" w:hanging="360"/>
+      </w:pPr>
+      <w:rPr>
+        <w:rFonts w:ascii="Wingdings" w:hAnsi="Wingdings" w:hint="default"/>
+        <w:sz w:val="20"/>
+      </w:rPr>
+    </w:lvl>
+  </w:abstractNum>
+  <w:abstractNum w:abstractNumId="5" w15:restartNumberingAfterBreak="0">
+    <w:nsid w:val="2E7744A6"/>
+    <w:multiLevelType w:val="multilevel"/>
+    <w:tmpl w:val="B7D2A3CC"/>
+    <w:lvl w:ilvl="0">
+      <w:start w:val="1"/>
+      <w:numFmt w:val="bullet"/>
+      <w:lvlText w:val=""/>
+      <w:lvlJc w:val="left"/>
+      <w:pPr>
+        <w:tabs>
+          <w:tab w:val="num" w:pos="720"/>
+        </w:tabs>
+        <w:ind w:left="720" w:hanging="360"/>
+      </w:pPr>
+      <w:rPr>
+        <w:rFonts w:ascii="Symbol" w:hAnsi="Symbol" w:hint="default"/>
+        <w:sz w:val="20"/>
+      </w:rPr>
+    </w:lvl>
+    <w:lvl w:ilvl="1" w:tentative="1">
+      <w:start w:val="1"/>
+      <w:numFmt w:val="bullet"/>
+      <w:lvlText w:val="o"/>
+      <w:lvlJc w:val="left"/>
+      <w:pPr>
+        <w:tabs>
+          <w:tab w:val="num" w:pos="1440"/>
+        </w:tabs>
+        <w:ind w:left="1440" w:hanging="360"/>
+      </w:pPr>
+      <w:rPr>
+        <w:rFonts w:ascii="Courier New" w:hAnsi="Courier New" w:hint="default"/>
+        <w:sz w:val="20"/>
+      </w:rPr>
+    </w:lvl>
+    <w:lvl w:ilvl="2" w:tentative="1">
+      <w:start w:val="1"/>
+      <w:numFmt w:val="bullet"/>
+      <w:lvlText w:val=""/>
+      <w:lvlJc w:val="left"/>
+      <w:pPr>
+        <w:tabs>
+          <w:tab w:val="num" w:pos="2160"/>
+        </w:tabs>
+        <w:ind w:left="2160" w:hanging="360"/>
+      </w:pPr>
+      <w:rPr>
+        <w:rFonts w:ascii="Wingdings" w:hAnsi="Wingdings" w:hint="default"/>
+        <w:sz w:val="20"/>
+      </w:rPr>
+    </w:lvl>
+    <w:lvl w:ilvl="3" w:tentative="1">
+      <w:start w:val="1"/>
+      <w:numFmt w:val="bullet"/>
+      <w:lvlText w:val=""/>
+      <w:lvlJc w:val="left"/>
+      <w:pPr>
+        <w:tabs>
+          <w:tab w:val="num" w:pos="2880"/>
+        </w:tabs>
+        <w:ind w:left="2880" w:hanging="360"/>
+      </w:pPr>
+      <w:rPr>
+        <w:rFonts w:ascii="Wingdings" w:hAnsi="Wingdings" w:hint="default"/>
+        <w:sz w:val="20"/>
+      </w:rPr>
+    </w:lvl>
+    <w:lvl w:ilvl="4" w:tentative="1">
+      <w:start w:val="1"/>
+      <w:numFmt w:val="bullet"/>
+      <w:lvlText w:val=""/>
+      <w:lvlJc w:val="left"/>
+      <w:pPr>
+        <w:tabs>
+          <w:tab w:val="num" w:pos="3600"/>
+        </w:tabs>
+        <w:ind w:left="3600" w:hanging="360"/>
+      </w:pPr>
+      <w:rPr>
+        <w:rFonts w:ascii="Wingdings" w:hAnsi="Wingdings" w:hint="default"/>
+        <w:sz w:val="20"/>
+      </w:rPr>
+    </w:lvl>
+    <w:lvl w:ilvl="5" w:tentative="1">
+      <w:start w:val="1"/>
+      <w:numFmt w:val="bullet"/>
+      <w:lvlText w:val=""/>
+      <w:lvlJc w:val="left"/>
+      <w:pPr>
+        <w:tabs>
+          <w:tab w:val="num" w:pos="4320"/>
+        </w:tabs>
+        <w:ind w:left="4320" w:hanging="360"/>
+      </w:pPr>
+      <w:rPr>
+        <w:rFonts w:ascii="Wingdings" w:hAnsi="Wingdings" w:hint="default"/>
+        <w:sz w:val="20"/>
+      </w:rPr>
+    </w:lvl>
+    <w:lvl w:ilvl="6" w:tentative="1">
+      <w:start w:val="1"/>
+      <w:numFmt w:val="bullet"/>
+      <w:lvlText w:val=""/>
+      <w:lvlJc w:val="left"/>
+      <w:pPr>
+        <w:tabs>
+          <w:tab w:val="num" w:pos="5040"/>
+        </w:tabs>
+        <w:ind w:left="5040" w:hanging="360"/>
+      </w:pPr>
+      <w:rPr>
+        <w:rFonts w:ascii="Wingdings" w:hAnsi="Wingdings" w:hint="default"/>
+        <w:sz w:val="20"/>
+      </w:rPr>
+    </w:lvl>
+    <w:lvl w:ilvl="7" w:tentative="1">
+      <w:start w:val="1"/>
+      <w:numFmt w:val="bullet"/>
+      <w:lvlText w:val=""/>
+      <w:lvlJc w:val="left"/>
+      <w:pPr>
+        <w:tabs>
+          <w:tab w:val="num" w:pos="5760"/>
+        </w:tabs>
+        <w:ind w:left="5760" w:hanging="360"/>
+      </w:pPr>
+      <w:rPr>
+        <w:rFonts w:ascii="Wingdings" w:hAnsi="Wingdings" w:hint="default"/>
+        <w:sz w:val="20"/>
+      </w:rPr>
+    </w:lvl>
+    <w:lvl w:ilvl="8" w:tentative="1">
+      <w:start w:val="1"/>
+      <w:numFmt w:val="bullet"/>
+      <w:lvlText w:val=""/>
+      <w:lvlJc w:val="left"/>
+      <w:pPr>
+        <w:tabs>
+          <w:tab w:val="num" w:pos="6480"/>
+        </w:tabs>
+        <w:ind w:left="6480" w:hanging="360"/>
+      </w:pPr>
+      <w:rPr>
+        <w:rFonts w:ascii="Wingdings" w:hAnsi="Wingdings" w:hint="default"/>
+        <w:sz w:val="20"/>
+      </w:rPr>
+    </w:lvl>
+  </w:abstractNum>
+  <w:abstractNum w:abstractNumId="6" w15:restartNumberingAfterBreak="0">
     <w:nsid w:val="3E9631E9"/>
     <w:multiLevelType w:val="multilevel"/>
     <w:tmpl w:val="E32462B2"/>
@@ -1440,7 +3855,7 @@
       </w:rPr>
     </w:lvl>
   </w:abstractNum>
-  <w:abstractNum w:abstractNumId="1" w15:restartNumberingAfterBreak="0">
+  <w:abstractNum w:abstractNumId="7" w15:restartNumberingAfterBreak="0">
     <w:nsid w:val="3F7E10D6"/>
     <w:multiLevelType w:val="multilevel"/>
     <w:tmpl w:val="09A439E6"/>
@@ -1589,7 +4004,156 @@
       </w:rPr>
     </w:lvl>
   </w:abstractNum>
-  <w:abstractNum w:abstractNumId="2" w15:restartNumberingAfterBreak="0">
+  <w:abstractNum w:abstractNumId="8" w15:restartNumberingAfterBreak="0">
+    <w:nsid w:val="50521CC1"/>
+    <w:multiLevelType w:val="multilevel"/>
+    <w:tmpl w:val="C130D8D2"/>
+    <w:lvl w:ilvl="0">
+      <w:start w:val="1"/>
+      <w:numFmt w:val="bullet"/>
+      <w:lvlText w:val=""/>
+      <w:lvlJc w:val="left"/>
+      <w:pPr>
+        <w:tabs>
+          <w:tab w:val="num" w:pos="720"/>
+        </w:tabs>
+        <w:ind w:left="720" w:hanging="360"/>
+      </w:pPr>
+      <w:rPr>
+        <w:rFonts w:ascii="Symbol" w:hAnsi="Symbol" w:hint="default"/>
+        <w:sz w:val="20"/>
+      </w:rPr>
+    </w:lvl>
+    <w:lvl w:ilvl="1" w:tentative="1">
+      <w:start w:val="1"/>
+      <w:numFmt w:val="bullet"/>
+      <w:lvlText w:val="o"/>
+      <w:lvlJc w:val="left"/>
+      <w:pPr>
+        <w:tabs>
+          <w:tab w:val="num" w:pos="1440"/>
+        </w:tabs>
+        <w:ind w:left="1440" w:hanging="360"/>
+      </w:pPr>
+      <w:rPr>
+        <w:rFonts w:ascii="Courier New" w:hAnsi="Courier New" w:hint="default"/>
+        <w:sz w:val="20"/>
+      </w:rPr>
+    </w:lvl>
+    <w:lvl w:ilvl="2" w:tentative="1">
+      <w:start w:val="1"/>
+      <w:numFmt w:val="bullet"/>
+      <w:lvlText w:val=""/>
+      <w:lvlJc w:val="left"/>
+      <w:pPr>
+        <w:tabs>
+          <w:tab w:val="num" w:pos="2160"/>
+        </w:tabs>
+        <w:ind w:left="2160" w:hanging="360"/>
+      </w:pPr>
+      <w:rPr>
+        <w:rFonts w:ascii="Wingdings" w:hAnsi="Wingdings" w:hint="default"/>
+        <w:sz w:val="20"/>
+      </w:rPr>
+    </w:lvl>
+    <w:lvl w:ilvl="3" w:tentative="1">
+      <w:start w:val="1"/>
+      <w:numFmt w:val="bullet"/>
+      <w:lvlText w:val=""/>
+      <w:lvlJc w:val="left"/>
+      <w:pPr>
+        <w:tabs>
+          <w:tab w:val="num" w:pos="2880"/>
+        </w:tabs>
+        <w:ind w:left="2880" w:hanging="360"/>
+      </w:pPr>
+      <w:rPr>
+        <w:rFonts w:ascii="Wingdings" w:hAnsi="Wingdings" w:hint="default"/>
+        <w:sz w:val="20"/>
+      </w:rPr>
+    </w:lvl>
+    <w:lvl w:ilvl="4" w:tentative="1">
+      <w:start w:val="1"/>
+      <w:numFmt w:val="bullet"/>
+      <w:lvlText w:val=""/>
+      <w:lvlJc w:val="left"/>
+      <w:pPr>
+        <w:tabs>
+          <w:tab w:val="num" w:pos="3600"/>
+        </w:tabs>
+        <w:ind w:left="3600" w:hanging="360"/>
+      </w:pPr>
+      <w:rPr>
+        <w:rFonts w:ascii="Wingdings" w:hAnsi="Wingdings" w:hint="default"/>
+        <w:sz w:val="20"/>
+      </w:rPr>
+    </w:lvl>
+    <w:lvl w:ilvl="5" w:tentative="1">
+      <w:start w:val="1"/>
+      <w:numFmt w:val="bullet"/>
+      <w:lvlText w:val=""/>
+      <w:lvlJc w:val="left"/>
+      <w:pPr>
+        <w:tabs>
+          <w:tab w:val="num" w:pos="4320"/>
+        </w:tabs>
+        <w:ind w:left="4320" w:hanging="360"/>
+      </w:pPr>
+      <w:rPr>
+        <w:rFonts w:ascii="Wingdings" w:hAnsi="Wingdings" w:hint="default"/>
+        <w:sz w:val="20"/>
+      </w:rPr>
+    </w:lvl>
+    <w:lvl w:ilvl="6" w:tentative="1">
+      <w:start w:val="1"/>
+      <w:numFmt w:val="bullet"/>
+      <w:lvlText w:val=""/>
+      <w:lvlJc w:val="left"/>
+      <w:pPr>
+        <w:tabs>
+          <w:tab w:val="num" w:pos="5040"/>
+        </w:tabs>
+        <w:ind w:left="5040" w:hanging="360"/>
+      </w:pPr>
+      <w:rPr>
+        <w:rFonts w:ascii="Wingdings" w:hAnsi="Wingdings" w:hint="default"/>
+        <w:sz w:val="20"/>
+      </w:rPr>
+    </w:lvl>
+    <w:lvl w:ilvl="7" w:tentative="1">
+      <w:start w:val="1"/>
+      <w:numFmt w:val="bullet"/>
+      <w:lvlText w:val=""/>
+      <w:lvlJc w:val="left"/>
+      <w:pPr>
+        <w:tabs>
+          <w:tab w:val="num" w:pos="5760"/>
+        </w:tabs>
+        <w:ind w:left="5760" w:hanging="360"/>
+      </w:pPr>
+      <w:rPr>
+        <w:rFonts w:ascii="Wingdings" w:hAnsi="Wingdings" w:hint="default"/>
+        <w:sz w:val="20"/>
+      </w:rPr>
+    </w:lvl>
+    <w:lvl w:ilvl="8" w:tentative="1">
+      <w:start w:val="1"/>
+      <w:numFmt w:val="bullet"/>
+      <w:lvlText w:val=""/>
+      <w:lvlJc w:val="left"/>
+      <w:pPr>
+        <w:tabs>
+          <w:tab w:val="num" w:pos="6480"/>
+        </w:tabs>
+        <w:ind w:left="6480" w:hanging="360"/>
+      </w:pPr>
+      <w:rPr>
+        <w:rFonts w:ascii="Wingdings" w:hAnsi="Wingdings" w:hint="default"/>
+        <w:sz w:val="20"/>
+      </w:rPr>
+    </w:lvl>
+  </w:abstractNum>
+  <w:abstractNum w:abstractNumId="9" w15:restartNumberingAfterBreak="0">
     <w:nsid w:val="54BB5396"/>
     <w:multiLevelType w:val="multilevel"/>
     <w:tmpl w:val="BABA2542"/>
@@ -1738,7 +4302,305 @@
       </w:rPr>
     </w:lvl>
   </w:abstractNum>
-  <w:abstractNum w:abstractNumId="3" w15:restartNumberingAfterBreak="0">
+  <w:abstractNum w:abstractNumId="10" w15:restartNumberingAfterBreak="0">
+    <w:nsid w:val="68A831BE"/>
+    <w:multiLevelType w:val="multilevel"/>
+    <w:tmpl w:val="E654B2A0"/>
+    <w:lvl w:ilvl="0">
+      <w:start w:val="1"/>
+      <w:numFmt w:val="bullet"/>
+      <w:lvlText w:val=""/>
+      <w:lvlJc w:val="left"/>
+      <w:pPr>
+        <w:tabs>
+          <w:tab w:val="num" w:pos="720"/>
+        </w:tabs>
+        <w:ind w:left="720" w:hanging="360"/>
+      </w:pPr>
+      <w:rPr>
+        <w:rFonts w:ascii="Symbol" w:hAnsi="Symbol" w:hint="default"/>
+        <w:sz w:val="20"/>
+      </w:rPr>
+    </w:lvl>
+    <w:lvl w:ilvl="1" w:tentative="1">
+      <w:start w:val="1"/>
+      <w:numFmt w:val="bullet"/>
+      <w:lvlText w:val="o"/>
+      <w:lvlJc w:val="left"/>
+      <w:pPr>
+        <w:tabs>
+          <w:tab w:val="num" w:pos="1440"/>
+        </w:tabs>
+        <w:ind w:left="1440" w:hanging="360"/>
+      </w:pPr>
+      <w:rPr>
+        <w:rFonts w:ascii="Courier New" w:hAnsi="Courier New" w:hint="default"/>
+        <w:sz w:val="20"/>
+      </w:rPr>
+    </w:lvl>
+    <w:lvl w:ilvl="2" w:tentative="1">
+      <w:start w:val="1"/>
+      <w:numFmt w:val="bullet"/>
+      <w:lvlText w:val=""/>
+      <w:lvlJc w:val="left"/>
+      <w:pPr>
+        <w:tabs>
+          <w:tab w:val="num" w:pos="2160"/>
+        </w:tabs>
+        <w:ind w:left="2160" w:hanging="360"/>
+      </w:pPr>
+      <w:rPr>
+        <w:rFonts w:ascii="Wingdings" w:hAnsi="Wingdings" w:hint="default"/>
+        <w:sz w:val="20"/>
+      </w:rPr>
+    </w:lvl>
+    <w:lvl w:ilvl="3" w:tentative="1">
+      <w:start w:val="1"/>
+      <w:numFmt w:val="bullet"/>
+      <w:lvlText w:val=""/>
+      <w:lvlJc w:val="left"/>
+      <w:pPr>
+        <w:tabs>
+          <w:tab w:val="num" w:pos="2880"/>
+        </w:tabs>
+        <w:ind w:left="2880" w:hanging="360"/>
+      </w:pPr>
+      <w:rPr>
+        <w:rFonts w:ascii="Wingdings" w:hAnsi="Wingdings" w:hint="default"/>
+        <w:sz w:val="20"/>
+      </w:rPr>
+    </w:lvl>
+    <w:lvl w:ilvl="4" w:tentative="1">
+      <w:start w:val="1"/>
+      <w:numFmt w:val="bullet"/>
+      <w:lvlText w:val=""/>
+      <w:lvlJc w:val="left"/>
+      <w:pPr>
+        <w:tabs>
+          <w:tab w:val="num" w:pos="3600"/>
+        </w:tabs>
+        <w:ind w:left="3600" w:hanging="360"/>
+      </w:pPr>
+      <w:rPr>
+        <w:rFonts w:ascii="Wingdings" w:hAnsi="Wingdings" w:hint="default"/>
+        <w:sz w:val="20"/>
+      </w:rPr>
+    </w:lvl>
+    <w:lvl w:ilvl="5" w:tentative="1">
+      <w:start w:val="1"/>
+      <w:numFmt w:val="bullet"/>
+      <w:lvlText w:val=""/>
+      <w:lvlJc w:val="left"/>
+      <w:pPr>
+        <w:tabs>
+          <w:tab w:val="num" w:pos="4320"/>
+        </w:tabs>
+        <w:ind w:left="4320" w:hanging="360"/>
+      </w:pPr>
+      <w:rPr>
+        <w:rFonts w:ascii="Wingdings" w:hAnsi="Wingdings" w:hint="default"/>
+        <w:sz w:val="20"/>
+      </w:rPr>
+    </w:lvl>
+    <w:lvl w:ilvl="6" w:tentative="1">
+      <w:start w:val="1"/>
+      <w:numFmt w:val="bullet"/>
+      <w:lvlText w:val=""/>
+      <w:lvlJc w:val="left"/>
+      <w:pPr>
+        <w:tabs>
+          <w:tab w:val="num" w:pos="5040"/>
+        </w:tabs>
+        <w:ind w:left="5040" w:hanging="360"/>
+      </w:pPr>
+      <w:rPr>
+        <w:rFonts w:ascii="Wingdings" w:hAnsi="Wingdings" w:hint="default"/>
+        <w:sz w:val="20"/>
+      </w:rPr>
+    </w:lvl>
+    <w:lvl w:ilvl="7" w:tentative="1">
+      <w:start w:val="1"/>
+      <w:numFmt w:val="bullet"/>
+      <w:lvlText w:val=""/>
+      <w:lvlJc w:val="left"/>
+      <w:pPr>
+        <w:tabs>
+          <w:tab w:val="num" w:pos="5760"/>
+        </w:tabs>
+        <w:ind w:left="5760" w:hanging="360"/>
+      </w:pPr>
+      <w:rPr>
+        <w:rFonts w:ascii="Wingdings" w:hAnsi="Wingdings" w:hint="default"/>
+        <w:sz w:val="20"/>
+      </w:rPr>
+    </w:lvl>
+    <w:lvl w:ilvl="8" w:tentative="1">
+      <w:start w:val="1"/>
+      <w:numFmt w:val="bullet"/>
+      <w:lvlText w:val=""/>
+      <w:lvlJc w:val="left"/>
+      <w:pPr>
+        <w:tabs>
+          <w:tab w:val="num" w:pos="6480"/>
+        </w:tabs>
+        <w:ind w:left="6480" w:hanging="360"/>
+      </w:pPr>
+      <w:rPr>
+        <w:rFonts w:ascii="Wingdings" w:hAnsi="Wingdings" w:hint="default"/>
+        <w:sz w:val="20"/>
+      </w:rPr>
+    </w:lvl>
+  </w:abstractNum>
+  <w:abstractNum w:abstractNumId="11" w15:restartNumberingAfterBreak="0">
+    <w:nsid w:val="70D14263"/>
+    <w:multiLevelType w:val="multilevel"/>
+    <w:tmpl w:val="44DAE300"/>
+    <w:lvl w:ilvl="0">
+      <w:start w:val="1"/>
+      <w:numFmt w:val="bullet"/>
+      <w:lvlText w:val=""/>
+      <w:lvlJc w:val="left"/>
+      <w:pPr>
+        <w:tabs>
+          <w:tab w:val="num" w:pos="720"/>
+        </w:tabs>
+        <w:ind w:left="720" w:hanging="360"/>
+      </w:pPr>
+      <w:rPr>
+        <w:rFonts w:ascii="Symbol" w:hAnsi="Symbol" w:hint="default"/>
+        <w:sz w:val="20"/>
+      </w:rPr>
+    </w:lvl>
+    <w:lvl w:ilvl="1" w:tentative="1">
+      <w:start w:val="1"/>
+      <w:numFmt w:val="bullet"/>
+      <w:lvlText w:val="o"/>
+      <w:lvlJc w:val="left"/>
+      <w:pPr>
+        <w:tabs>
+          <w:tab w:val="num" w:pos="1440"/>
+        </w:tabs>
+        <w:ind w:left="1440" w:hanging="360"/>
+      </w:pPr>
+      <w:rPr>
+        <w:rFonts w:ascii="Courier New" w:hAnsi="Courier New" w:hint="default"/>
+        <w:sz w:val="20"/>
+      </w:rPr>
+    </w:lvl>
+    <w:lvl w:ilvl="2" w:tentative="1">
+      <w:start w:val="1"/>
+      <w:numFmt w:val="bullet"/>
+      <w:lvlText w:val=""/>
+      <w:lvlJc w:val="left"/>
+      <w:pPr>
+        <w:tabs>
+          <w:tab w:val="num" w:pos="2160"/>
+        </w:tabs>
+        <w:ind w:left="2160" w:hanging="360"/>
+      </w:pPr>
+      <w:rPr>
+        <w:rFonts w:ascii="Wingdings" w:hAnsi="Wingdings" w:hint="default"/>
+        <w:sz w:val="20"/>
+      </w:rPr>
+    </w:lvl>
+    <w:lvl w:ilvl="3" w:tentative="1">
+      <w:start w:val="1"/>
+      <w:numFmt w:val="bullet"/>
+      <w:lvlText w:val=""/>
+      <w:lvlJc w:val="left"/>
+      <w:pPr>
+        <w:tabs>
+          <w:tab w:val="num" w:pos="2880"/>
+        </w:tabs>
+        <w:ind w:left="2880" w:hanging="360"/>
+      </w:pPr>
+      <w:rPr>
+        <w:rFonts w:ascii="Wingdings" w:hAnsi="Wingdings" w:hint="default"/>
+        <w:sz w:val="20"/>
+      </w:rPr>
+    </w:lvl>
+    <w:lvl w:ilvl="4" w:tentative="1">
+      <w:start w:val="1"/>
+      <w:numFmt w:val="bullet"/>
+      <w:lvlText w:val=""/>
+      <w:lvlJc w:val="left"/>
+      <w:pPr>
+        <w:tabs>
+          <w:tab w:val="num" w:pos="3600"/>
+        </w:tabs>
+        <w:ind w:left="3600" w:hanging="360"/>
+      </w:pPr>
+      <w:rPr>
+        <w:rFonts w:ascii="Wingdings" w:hAnsi="Wingdings" w:hint="default"/>
+        <w:sz w:val="20"/>
+      </w:rPr>
+    </w:lvl>
+    <w:lvl w:ilvl="5" w:tentative="1">
+      <w:start w:val="1"/>
+      <w:numFmt w:val="bullet"/>
+      <w:lvlText w:val=""/>
+      <w:lvlJc w:val="left"/>
+      <w:pPr>
+        <w:tabs>
+          <w:tab w:val="num" w:pos="4320"/>
+        </w:tabs>
+        <w:ind w:left="4320" w:hanging="360"/>
+      </w:pPr>
+      <w:rPr>
+        <w:rFonts w:ascii="Wingdings" w:hAnsi="Wingdings" w:hint="default"/>
+        <w:sz w:val="20"/>
+      </w:rPr>
+    </w:lvl>
+    <w:lvl w:ilvl="6" w:tentative="1">
+      <w:start w:val="1"/>
+      <w:numFmt w:val="bullet"/>
+      <w:lvlText w:val=""/>
+      <w:lvlJc w:val="left"/>
+      <w:pPr>
+        <w:tabs>
+          <w:tab w:val="num" w:pos="5040"/>
+        </w:tabs>
+        <w:ind w:left="5040" w:hanging="360"/>
+      </w:pPr>
+      <w:rPr>
+        <w:rFonts w:ascii="Wingdings" w:hAnsi="Wingdings" w:hint="default"/>
+        <w:sz w:val="20"/>
+      </w:rPr>
+    </w:lvl>
+    <w:lvl w:ilvl="7" w:tentative="1">
+      <w:start w:val="1"/>
+      <w:numFmt w:val="bullet"/>
+      <w:lvlText w:val=""/>
+      <w:lvlJc w:val="left"/>
+      <w:pPr>
+        <w:tabs>
+          <w:tab w:val="num" w:pos="5760"/>
+        </w:tabs>
+        <w:ind w:left="5760" w:hanging="360"/>
+      </w:pPr>
+      <w:rPr>
+        <w:rFonts w:ascii="Wingdings" w:hAnsi="Wingdings" w:hint="default"/>
+        <w:sz w:val="20"/>
+      </w:rPr>
+    </w:lvl>
+    <w:lvl w:ilvl="8" w:tentative="1">
+      <w:start w:val="1"/>
+      <w:numFmt w:val="bullet"/>
+      <w:lvlText w:val=""/>
+      <w:lvlJc w:val="left"/>
+      <w:pPr>
+        <w:tabs>
+          <w:tab w:val="num" w:pos="6480"/>
+        </w:tabs>
+        <w:ind w:left="6480" w:hanging="360"/>
+      </w:pPr>
+      <w:rPr>
+        <w:rFonts w:ascii="Wingdings" w:hAnsi="Wingdings" w:hint="default"/>
+        <w:sz w:val="20"/>
+      </w:rPr>
+    </w:lvl>
+  </w:abstractNum>
+  <w:abstractNum w:abstractNumId="12" w15:restartNumberingAfterBreak="0">
     <w:nsid w:val="78A63B98"/>
     <w:multiLevelType w:val="multilevel"/>
     <w:tmpl w:val="E8220544"/>
@@ -1887,7 +4749,7 @@
       </w:rPr>
     </w:lvl>
   </w:abstractNum>
-  <w:abstractNum w:abstractNumId="4" w15:restartNumberingAfterBreak="0">
+  <w:abstractNum w:abstractNumId="13" w15:restartNumberingAfterBreak="0">
     <w:nsid w:val="78E00502"/>
     <w:multiLevelType w:val="multilevel"/>
     <w:tmpl w:val="9708883E"/>
@@ -2037,19 +4899,46 @@
     </w:lvl>
   </w:abstractNum>
   <w:num w:numId="1" w16cid:durableId="1612784573">
+    <w:abstractNumId w:val="7"/>
+  </w:num>
+  <w:num w:numId="2" w16cid:durableId="1633247903">
+    <w:abstractNumId w:val="9"/>
+  </w:num>
+  <w:num w:numId="3" w16cid:durableId="1390614492">
+    <w:abstractNumId w:val="6"/>
+  </w:num>
+  <w:num w:numId="4" w16cid:durableId="1081874773">
+    <w:abstractNumId w:val="12"/>
+  </w:num>
+  <w:num w:numId="5" w16cid:durableId="433549329">
+    <w:abstractNumId w:val="13"/>
+  </w:num>
+  <w:num w:numId="6" w16cid:durableId="535853071">
+    <w:abstractNumId w:val="3"/>
+  </w:num>
+  <w:num w:numId="7" w16cid:durableId="1449666123">
+    <w:abstractNumId w:val="4"/>
+  </w:num>
+  <w:num w:numId="8" w16cid:durableId="1458717789">
+    <w:abstractNumId w:val="8"/>
+  </w:num>
+  <w:num w:numId="9" w16cid:durableId="508832536">
+    <w:abstractNumId w:val="11"/>
+  </w:num>
+  <w:num w:numId="10" w16cid:durableId="599337643">
+    <w:abstractNumId w:val="10"/>
+  </w:num>
+  <w:num w:numId="11" w16cid:durableId="737744850">
+    <w:abstractNumId w:val="5"/>
+  </w:num>
+  <w:num w:numId="12" w16cid:durableId="707725856">
     <w:abstractNumId w:val="1"/>
   </w:num>
-  <w:num w:numId="2" w16cid:durableId="1633247903">
-    <w:abstractNumId w:val="2"/>
-  </w:num>
-  <w:num w:numId="3" w16cid:durableId="1390614492">
+  <w:num w:numId="13" w16cid:durableId="2126348110">
     <w:abstractNumId w:val="0"/>
   </w:num>
-  <w:num w:numId="4" w16cid:durableId="1081874773">
-    <w:abstractNumId w:val="3"/>
-  </w:num>
-  <w:num w:numId="5" w16cid:durableId="433549329">
-    <w:abstractNumId w:val="4"/>
+  <w:num w:numId="14" w16cid:durableId="555239297">
+    <w:abstractNumId w:val="2"/>
   </w:num>
 </w:numbering>
 </file>

</xml_diff>